<commit_message>
fechamento objetivos e hipóteses
</commit_message>
<xml_diff>
--- a/Pre-Projeto/Anotacoes/Feedback Hipoteses Pre-Projeto Tese.docx
+++ b/Pre-Projeto/Anotacoes/Feedback Hipoteses Pre-Projeto Tese.docx
@@ -4,6 +4,253 @@
   <w:body>
     <w:p>
       <w:r>
+        <w:rPr>
+          <w:noProof/>
+        </w:rPr>
+        <mc:AlternateContent>
+          <mc:Choice Requires="wpi">
+            <w:drawing>
+              <wp:anchor distT="0" distB="0" distL="114300" distR="114300" simplePos="0" relativeHeight="251691008" behindDoc="0" locked="0" layoutInCell="1" allowOverlap="1" wp14:anchorId="4A9E4F70" wp14:editId="695668F8">
+                <wp:simplePos x="0" y="0"/>
+                <wp:positionH relativeFrom="column">
+                  <wp:posOffset>7565616</wp:posOffset>
+                </wp:positionH>
+                <wp:positionV relativeFrom="paragraph">
+                  <wp:posOffset>940562</wp:posOffset>
+                </wp:positionV>
+                <wp:extent cx="360" cy="360"/>
+                <wp:effectExtent l="38100" t="38100" r="38100" b="38100"/>
+                <wp:wrapNone/>
+                <wp:docPr id="190167218" name="Tinta 33"/>
+                <wp:cNvGraphicFramePr/>
+                <a:graphic xmlns:a="http://schemas.openxmlformats.org/drawingml/2006/main">
+                  <a:graphicData uri="http://schemas.microsoft.com/office/word/2010/wordprocessingInk">
+                    <w14:contentPart bwMode="auto" r:id="rId5">
+                      <w14:nvContentPartPr>
+                        <w14:cNvContentPartPr/>
+                      </w14:nvContentPartPr>
+                      <w14:xfrm>
+                        <a:off x="0" y="0"/>
+                        <a:ext cx="360" cy="360"/>
+                      </w14:xfrm>
+                    </w14:contentPart>
+                  </a:graphicData>
+                </a:graphic>
+              </wp:anchor>
+            </w:drawing>
+          </mc:Choice>
+          <mc:Fallback>
+            <w:pict>
+              <v:shapetype w14:anchorId="76B31125" id="_x0000_t75" coordsize="21600,21600" o:spt="75" o:preferrelative="t" path="m@4@5l@4@11@9@11@9@5xe" filled="f" stroked="f">
+                <v:stroke joinstyle="miter"/>
+                <v:formulas>
+                  <v:f eqn="if lineDrawn pixelLineWidth 0"/>
+                  <v:f eqn="sum @0 1 0"/>
+                  <v:f eqn="sum 0 0 @1"/>
+                  <v:f eqn="prod @2 1 2"/>
+                  <v:f eqn="prod @3 21600 pixelWidth"/>
+                  <v:f eqn="prod @3 21600 pixelHeight"/>
+                  <v:f eqn="sum @0 0 1"/>
+                  <v:f eqn="prod @6 1 2"/>
+                  <v:f eqn="prod @7 21600 pixelWidth"/>
+                  <v:f eqn="sum @8 21600 0"/>
+                  <v:f eqn="prod @7 21600 pixelHeight"/>
+                  <v:f eqn="sum @10 21600 0"/>
+                </v:formulas>
+                <v:path o:extrusionok="f" gradientshapeok="t" o:connecttype="rect"/>
+                <o:lock v:ext="edit" aspectratio="t"/>
+              </v:shapetype>
+              <v:shape id="Tinta 33" o:spid="_x0000_s1026" type="#_x0000_t75" style="position:absolute;margin-left:595.2pt;margin-top:73.55pt;width:1.05pt;height:1.05pt;z-index:251691008;visibility:visible;mso-wrap-style:square;mso-wrap-distance-left:9pt;mso-wrap-distance-top:0;mso-wrap-distance-right:9pt;mso-wrap-distance-bottom:0;mso-position-horizontal:absolute;mso-position-horizontal-relative:text;mso-position-vertical:absolute;mso-position-vertical-relative:text" o:gfxdata="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">
+                <v:imagedata r:id="rId6" o:title=""/>
+              </v:shape>
+            </w:pict>
+          </mc:Fallback>
+        </mc:AlternateContent>
+      </w:r>
+      <w:r>
+        <w:rPr>
+          <w:noProof/>
+        </w:rPr>
+        <mc:AlternateContent>
+          <mc:Choice Requires="wpi">
+            <w:drawing>
+              <wp:anchor distT="0" distB="0" distL="114300" distR="114300" simplePos="0" relativeHeight="251664384" behindDoc="0" locked="0" layoutInCell="1" allowOverlap="1" wp14:anchorId="6EBD4FA8" wp14:editId="1923C676">
+                <wp:simplePos x="0" y="0"/>
+                <wp:positionH relativeFrom="column">
+                  <wp:posOffset>7260779</wp:posOffset>
+                </wp:positionH>
+                <wp:positionV relativeFrom="paragraph">
+                  <wp:posOffset>1040282</wp:posOffset>
+                </wp:positionV>
+                <wp:extent cx="360" cy="360"/>
+                <wp:effectExtent l="38100" t="38100" r="38100" b="38100"/>
+                <wp:wrapNone/>
+                <wp:docPr id="1174080890" name="Tinta 6"/>
+                <wp:cNvGraphicFramePr/>
+                <a:graphic xmlns:a="http://schemas.openxmlformats.org/drawingml/2006/main">
+                  <a:graphicData uri="http://schemas.microsoft.com/office/word/2010/wordprocessingInk">
+                    <w14:contentPart bwMode="auto" r:id="rId7">
+                      <w14:nvContentPartPr>
+                        <w14:cNvContentPartPr/>
+                      </w14:nvContentPartPr>
+                      <w14:xfrm>
+                        <a:off x="0" y="0"/>
+                        <a:ext cx="360" cy="360"/>
+                      </w14:xfrm>
+                    </w14:contentPart>
+                  </a:graphicData>
+                </a:graphic>
+              </wp:anchor>
+            </w:drawing>
+          </mc:Choice>
+          <mc:Fallback>
+            <w:pict>
+              <v:shape w14:anchorId="693E5988" id="Tinta 6" o:spid="_x0000_s1026" type="#_x0000_t75" style="position:absolute;margin-left:571.2pt;margin-top:81.4pt;width:1.05pt;height:1.05pt;z-index:251664384;visibility:visible;mso-wrap-style:square;mso-wrap-distance-left:9pt;mso-wrap-distance-top:0;mso-wrap-distance-right:9pt;mso-wrap-distance-bottom:0;mso-position-horizontal:absolute;mso-position-horizontal-relative:text;mso-position-vertical:absolute;mso-position-vertical-relative:text" o:gfxdata="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">
+                <v:imagedata r:id="rId8" o:title=""/>
+              </v:shape>
+            </w:pict>
+          </mc:Fallback>
+        </mc:AlternateContent>
+      </w:r>
+      <w:r>
+        <w:rPr>
+          <w:noProof/>
+        </w:rPr>
+        <mc:AlternateContent>
+          <mc:Choice Requires="wpi">
+            <w:drawing>
+              <wp:anchor distT="0" distB="0" distL="114300" distR="114300" simplePos="0" relativeHeight="251661312" behindDoc="0" locked="0" layoutInCell="1" allowOverlap="1" wp14:anchorId="1741B8CC" wp14:editId="41565BF5">
+                <wp:simplePos x="0" y="0"/>
+                <wp:positionH relativeFrom="column">
+                  <wp:posOffset>285419</wp:posOffset>
+                </wp:positionH>
+                <wp:positionV relativeFrom="paragraph">
+                  <wp:posOffset>605762</wp:posOffset>
+                </wp:positionV>
+                <wp:extent cx="855720" cy="19080"/>
+                <wp:effectExtent l="38100" t="38100" r="40005" b="38100"/>
+                <wp:wrapNone/>
+                <wp:docPr id="449074029" name="Tinta 3"/>
+                <wp:cNvGraphicFramePr/>
+                <a:graphic xmlns:a="http://schemas.openxmlformats.org/drawingml/2006/main">
+                  <a:graphicData uri="http://schemas.microsoft.com/office/word/2010/wordprocessingInk">
+                    <w14:contentPart bwMode="auto" r:id="rId9">
+                      <w14:nvContentPartPr>
+                        <w14:cNvContentPartPr/>
+                      </w14:nvContentPartPr>
+                      <w14:xfrm>
+                        <a:off x="0" y="0"/>
+                        <a:ext cx="855720" cy="19080"/>
+                      </w14:xfrm>
+                    </w14:contentPart>
+                  </a:graphicData>
+                </a:graphic>
+              </wp:anchor>
+            </w:drawing>
+          </mc:Choice>
+          <mc:Fallback>
+            <w:pict>
+              <v:shape w14:anchorId="2E18A85C" id="Tinta 3" o:spid="_x0000_s1026" type="#_x0000_t75" style="position:absolute;margin-left:21.95pt;margin-top:47.2pt;width:68.4pt;height:2.45pt;z-index:251661312;visibility:visible;mso-wrap-style:square;mso-wrap-distance-left:9pt;mso-wrap-distance-top:0;mso-wrap-distance-right:9pt;mso-wrap-distance-bottom:0;mso-position-horizontal:absolute;mso-position-horizontal-relative:text;mso-position-vertical:absolute;mso-position-vertical-relative:text" o:gfxdata="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">
+                <v:imagedata r:id="rId10" o:title=""/>
+              </v:shape>
+            </w:pict>
+          </mc:Fallback>
+        </mc:AlternateContent>
+      </w:r>
+      <w:r>
+        <w:rPr>
+          <w:noProof/>
+        </w:rPr>
+        <mc:AlternateContent>
+          <mc:Choice Requires="wpi">
+            <w:drawing>
+              <wp:anchor distT="0" distB="0" distL="114300" distR="114300" simplePos="0" relativeHeight="251660288" behindDoc="0" locked="0" layoutInCell="1" allowOverlap="1" wp14:anchorId="54625A03" wp14:editId="4E432B14">
+                <wp:simplePos x="0" y="0"/>
+                <wp:positionH relativeFrom="column">
+                  <wp:posOffset>2864819</wp:posOffset>
+                </wp:positionH>
+                <wp:positionV relativeFrom="paragraph">
+                  <wp:posOffset>366002</wp:posOffset>
+                </wp:positionV>
+                <wp:extent cx="2410920" cy="30600"/>
+                <wp:effectExtent l="38100" t="38100" r="27940" b="45720"/>
+                <wp:wrapNone/>
+                <wp:docPr id="128610233" name="Tinta 2"/>
+                <wp:cNvGraphicFramePr/>
+                <a:graphic xmlns:a="http://schemas.openxmlformats.org/drawingml/2006/main">
+                  <a:graphicData uri="http://schemas.microsoft.com/office/word/2010/wordprocessingInk">
+                    <w14:contentPart bwMode="auto" r:id="rId11">
+                      <w14:nvContentPartPr>
+                        <w14:cNvContentPartPr/>
+                      </w14:nvContentPartPr>
+                      <w14:xfrm>
+                        <a:off x="0" y="0"/>
+                        <a:ext cx="2410920" cy="30600"/>
+                      </w14:xfrm>
+                    </w14:contentPart>
+                  </a:graphicData>
+                </a:graphic>
+              </wp:anchor>
+            </w:drawing>
+          </mc:Choice>
+          <mc:Fallback>
+            <w:pict>
+              <v:shape w14:anchorId="042D46C7" id="Tinta 2" o:spid="_x0000_s1026" type="#_x0000_t75" style="position:absolute;margin-left:225.1pt;margin-top:28.3pt;width:190.85pt;height:3.35pt;z-index:251660288;visibility:visible;mso-wrap-style:square;mso-wrap-distance-left:9pt;mso-wrap-distance-top:0;mso-wrap-distance-right:9pt;mso-wrap-distance-bottom:0;mso-position-horizontal:absolute;mso-position-horizontal-relative:text;mso-position-vertical:absolute;mso-position-vertical-relative:text" o:gfxdata="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">
+                <v:imagedata r:id="rId12" o:title=""/>
+              </v:shape>
+            </w:pict>
+          </mc:Fallback>
+        </mc:AlternateContent>
+      </w:r>
+      <w:r>
+        <w:rPr>
+          <w:noProof/>
+        </w:rPr>
+        <mc:AlternateContent>
+          <mc:Choice Requires="wpi">
+            <w:drawing>
+              <wp:anchor distT="0" distB="0" distL="114300" distR="114300" simplePos="0" relativeHeight="251659264" behindDoc="0" locked="0" layoutInCell="1" allowOverlap="1" wp14:anchorId="0ED9812D" wp14:editId="7A61CBF8">
+                <wp:simplePos x="0" y="0"/>
+                <wp:positionH relativeFrom="column">
+                  <wp:posOffset>7676579</wp:posOffset>
+                </wp:positionH>
+                <wp:positionV relativeFrom="paragraph">
+                  <wp:posOffset>319202</wp:posOffset>
+                </wp:positionV>
+                <wp:extent cx="360" cy="360"/>
+                <wp:effectExtent l="38100" t="38100" r="38100" b="38100"/>
+                <wp:wrapNone/>
+                <wp:docPr id="273666258" name="Tinta 1"/>
+                <wp:cNvGraphicFramePr/>
+                <a:graphic xmlns:a="http://schemas.openxmlformats.org/drawingml/2006/main">
+                  <a:graphicData uri="http://schemas.microsoft.com/office/word/2010/wordprocessingInk">
+                    <w14:contentPart bwMode="auto" r:id="rId13">
+                      <w14:nvContentPartPr>
+                        <w14:cNvContentPartPr/>
+                      </w14:nvContentPartPr>
+                      <w14:xfrm>
+                        <a:off x="0" y="0"/>
+                        <a:ext cx="360" cy="360"/>
+                      </w14:xfrm>
+                    </w14:contentPart>
+                  </a:graphicData>
+                </a:graphic>
+              </wp:anchor>
+            </w:drawing>
+          </mc:Choice>
+          <mc:Fallback>
+            <w:pict>
+              <v:shape w14:anchorId="19B33662" id="Tinta 1" o:spid="_x0000_s1026" type="#_x0000_t75" style="position:absolute;margin-left:603.95pt;margin-top:24.65pt;width:1.05pt;height:1.05pt;z-index:251659264;visibility:visible;mso-wrap-style:square;mso-wrap-distance-left:9pt;mso-wrap-distance-top:0;mso-wrap-distance-right:9pt;mso-wrap-distance-bottom:0;mso-position-horizontal:absolute;mso-position-horizontal-relative:text;mso-position-vertical:absolute;mso-position-vertical-relative:text" o:gfxdata="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">
+                <v:imagedata r:id="rId8" o:title=""/>
+              </v:shape>
+            </w:pict>
+          </mc:Fallback>
+        </mc:AlternateContent>
+      </w:r>
+      <w:r>
+        <w:rPr>
+          <w:noProof/>
+        </w:rPr>
         <w:drawing>
           <wp:inline distT="0" distB="0" distL="0" distR="0" wp14:anchorId="5244A861" wp14:editId="6383D44B">
             <wp:extent cx="5400040" cy="798195"/>
@@ -20,7 +267,7 @@
                     <pic:cNvPicPr/>
                   </pic:nvPicPr>
                   <pic:blipFill>
-                    <a:blip r:embed="rId5"/>
+                    <a:blip r:embed="rId14"/>
                     <a:stretch>
                       <a:fillRect/>
                     </a:stretch>
@@ -43,6 +290,60 @@
     </w:p>
     <w:p>
       <w:r>
+        <w:rPr>
+          <w:noProof/>
+        </w:rPr>
+        <mc:AlternateContent>
+          <mc:Choice Requires="wpi">
+            <w:drawing>
+              <wp:anchor distT="0" distB="0" distL="114300" distR="114300" simplePos="0" relativeHeight="251663360" behindDoc="0" locked="0" layoutInCell="1" allowOverlap="1" wp14:anchorId="66019381" wp14:editId="56400B56">
+                <wp:simplePos x="0" y="0"/>
+                <wp:positionH relativeFrom="column">
+                  <wp:posOffset>1187939</wp:posOffset>
+                </wp:positionH>
+                <wp:positionV relativeFrom="paragraph">
+                  <wp:posOffset>202972</wp:posOffset>
+                </wp:positionV>
+                <wp:extent cx="3271520" cy="635"/>
+                <wp:effectExtent l="38100" t="38100" r="43180" b="37465"/>
+                <wp:wrapNone/>
+                <wp:docPr id="83934894" name="Tinta 5"/>
+                <wp:cNvGraphicFramePr/>
+                <a:graphic xmlns:a="http://schemas.openxmlformats.org/drawingml/2006/main">
+                  <a:graphicData uri="http://schemas.microsoft.com/office/word/2010/wordprocessingInk">
+                    <w14:contentPart bwMode="auto" r:id="rId15">
+                      <w14:nvContentPartPr>
+                        <w14:cNvContentPartPr/>
+                      </w14:nvContentPartPr>
+                      <w14:xfrm>
+                        <a:off x="0" y="0"/>
+                        <a:ext cx="3271520" cy="635"/>
+                      </w14:xfrm>
+                    </w14:contentPart>
+                  </a:graphicData>
+                </a:graphic>
+                <wp14:sizeRelH relativeFrom="margin">
+                  <wp14:pctWidth>0</wp14:pctWidth>
+                </wp14:sizeRelH>
+                <wp14:sizeRelV relativeFrom="margin">
+                  <wp14:pctHeight>0</wp14:pctHeight>
+                </wp14:sizeRelV>
+              </wp:anchor>
+            </w:drawing>
+          </mc:Choice>
+          <mc:Fallback>
+            <w:pict>
+              <v:shape w14:anchorId="0EA7FE6C" id="Tinta 5" o:spid="_x0000_s1026" type="#_x0000_t75" style="position:absolute;margin-left:93.05pt;margin-top:15.15pt;width:258.55pt;height:1.75pt;z-index:251663360;visibility:visible;mso-wrap-style:square;mso-width-percent:0;mso-height-percent:0;mso-wrap-distance-left:9pt;mso-wrap-distance-top:0;mso-wrap-distance-right:9pt;mso-wrap-distance-bottom:0;mso-position-horizontal:absolute;mso-position-horizontal-relative:text;mso-position-vertical:absolute;mso-position-vertical-relative:text;mso-width-percent:0;mso-height-percent:0;mso-width-relative:margin;mso-height-relative:margin" o:gfxdata="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">
+                <v:imagedata r:id="rId16" o:title=""/>
+              </v:shape>
+            </w:pict>
+          </mc:Fallback>
+        </mc:AlternateContent>
+      </w:r>
+      <w:r>
+        <w:rPr>
+          <w:noProof/>
+        </w:rPr>
         <w:drawing>
           <wp:inline distT="0" distB="0" distL="0" distR="0" wp14:anchorId="5F182092" wp14:editId="4788F0B2">
             <wp:extent cx="5400040" cy="855980"/>
@@ -59,7 +360,7 @@
                     <pic:cNvPicPr/>
                   </pic:nvPicPr>
                   <pic:blipFill>
-                    <a:blip r:embed="rId6"/>
+                    <a:blip r:embed="rId17"/>
                     <a:stretch>
                       <a:fillRect/>
                     </a:stretch>
@@ -82,6 +383,459 @@
     </w:p>
     <w:p>
       <w:r>
+        <w:rPr>
+          <w:noProof/>
+        </w:rPr>
+        <mc:AlternateContent>
+          <mc:Choice Requires="wpi">
+            <w:drawing>
+              <wp:anchor distT="0" distB="0" distL="114300" distR="114300" simplePos="0" relativeHeight="251681792" behindDoc="0" locked="0" layoutInCell="1" allowOverlap="1" wp14:anchorId="4720D7A2" wp14:editId="4F149F7F">
+                <wp:simplePos x="0" y="0"/>
+                <wp:positionH relativeFrom="column">
+                  <wp:posOffset>7548059</wp:posOffset>
+                </wp:positionH>
+                <wp:positionV relativeFrom="paragraph">
+                  <wp:posOffset>943357</wp:posOffset>
+                </wp:positionV>
+                <wp:extent cx="360" cy="360"/>
+                <wp:effectExtent l="38100" t="38100" r="38100" b="38100"/>
+                <wp:wrapNone/>
+                <wp:docPr id="1840291889" name="Tinta 24"/>
+                <wp:cNvGraphicFramePr/>
+                <a:graphic xmlns:a="http://schemas.openxmlformats.org/drawingml/2006/main">
+                  <a:graphicData uri="http://schemas.microsoft.com/office/word/2010/wordprocessingInk">
+                    <w14:contentPart bwMode="auto" r:id="rId18">
+                      <w14:nvContentPartPr>
+                        <w14:cNvContentPartPr/>
+                      </w14:nvContentPartPr>
+                      <w14:xfrm>
+                        <a:off x="0" y="0"/>
+                        <a:ext cx="360" cy="360"/>
+                      </w14:xfrm>
+                    </w14:contentPart>
+                  </a:graphicData>
+                </a:graphic>
+              </wp:anchor>
+            </w:drawing>
+          </mc:Choice>
+          <mc:Fallback>
+            <w:pict>
+              <v:shape w14:anchorId="5809C998" id="Tinta 24" o:spid="_x0000_s1026" type="#_x0000_t75" style="position:absolute;margin-left:593.85pt;margin-top:73.8pt;width:1.05pt;height:1.05pt;z-index:251681792;visibility:visible;mso-wrap-style:square;mso-wrap-distance-left:9pt;mso-wrap-distance-top:0;mso-wrap-distance-right:9pt;mso-wrap-distance-bottom:0;mso-position-horizontal:absolute;mso-position-horizontal-relative:text;mso-position-vertical:absolute;mso-position-vertical-relative:text" o:gfxdata="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">
+                <v:imagedata r:id="rId8" o:title=""/>
+              </v:shape>
+            </w:pict>
+          </mc:Fallback>
+        </mc:AlternateContent>
+      </w:r>
+      <w:r>
+        <w:rPr>
+          <w:noProof/>
+        </w:rPr>
+        <mc:AlternateContent>
+          <mc:Choice Requires="wpi">
+            <w:drawing>
+              <wp:anchor distT="0" distB="0" distL="114300" distR="114300" simplePos="0" relativeHeight="251677696" behindDoc="0" locked="0" layoutInCell="1" allowOverlap="1" wp14:anchorId="4083908E" wp14:editId="5CE29B8F">
+                <wp:simplePos x="0" y="0"/>
+                <wp:positionH relativeFrom="column">
+                  <wp:posOffset>6328739</wp:posOffset>
+                </wp:positionH>
+                <wp:positionV relativeFrom="paragraph">
+                  <wp:posOffset>181597</wp:posOffset>
+                </wp:positionV>
+                <wp:extent cx="360" cy="360"/>
+                <wp:effectExtent l="38100" t="38100" r="38100" b="38100"/>
+                <wp:wrapNone/>
+                <wp:docPr id="1511450970" name="Tinta 20"/>
+                <wp:cNvGraphicFramePr/>
+                <a:graphic xmlns:a="http://schemas.openxmlformats.org/drawingml/2006/main">
+                  <a:graphicData uri="http://schemas.microsoft.com/office/word/2010/wordprocessingInk">
+                    <w14:contentPart bwMode="auto" r:id="rId19">
+                      <w14:nvContentPartPr>
+                        <w14:cNvContentPartPr/>
+                      </w14:nvContentPartPr>
+                      <w14:xfrm>
+                        <a:off x="0" y="0"/>
+                        <a:ext cx="360" cy="360"/>
+                      </w14:xfrm>
+                    </w14:contentPart>
+                  </a:graphicData>
+                </a:graphic>
+              </wp:anchor>
+            </w:drawing>
+          </mc:Choice>
+          <mc:Fallback>
+            <w:pict>
+              <v:shape w14:anchorId="07963721" id="Tinta 20" o:spid="_x0000_s1026" type="#_x0000_t75" style="position:absolute;margin-left:497.85pt;margin-top:13.8pt;width:1.05pt;height:1.05pt;z-index:251677696;visibility:visible;mso-wrap-style:square;mso-wrap-distance-left:9pt;mso-wrap-distance-top:0;mso-wrap-distance-right:9pt;mso-wrap-distance-bottom:0;mso-position-horizontal:absolute;mso-position-horizontal-relative:text;mso-position-vertical:absolute;mso-position-vertical-relative:text" o:gfxdata="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">
+                <v:imagedata r:id="rId8" o:title=""/>
+              </v:shape>
+            </w:pict>
+          </mc:Fallback>
+        </mc:AlternateContent>
+      </w:r>
+      <w:r>
+        <w:rPr>
+          <w:noProof/>
+        </w:rPr>
+        <mc:AlternateContent>
+          <mc:Choice Requires="wpi">
+            <w:drawing>
+              <wp:anchor distT="0" distB="0" distL="114300" distR="114300" simplePos="0" relativeHeight="251676672" behindDoc="0" locked="0" layoutInCell="1" allowOverlap="1" wp14:anchorId="410E3588" wp14:editId="5135A70E">
+                <wp:simplePos x="0" y="0"/>
+                <wp:positionH relativeFrom="column">
+                  <wp:posOffset>502139</wp:posOffset>
+                </wp:positionH>
+                <wp:positionV relativeFrom="paragraph">
+                  <wp:posOffset>802597</wp:posOffset>
+                </wp:positionV>
+                <wp:extent cx="492480" cy="6120"/>
+                <wp:effectExtent l="38100" t="38100" r="41275" b="51435"/>
+                <wp:wrapNone/>
+                <wp:docPr id="942968702" name="Tinta 19"/>
+                <wp:cNvGraphicFramePr/>
+                <a:graphic xmlns:a="http://schemas.openxmlformats.org/drawingml/2006/main">
+                  <a:graphicData uri="http://schemas.microsoft.com/office/word/2010/wordprocessingInk">
+                    <w14:contentPart bwMode="auto" r:id="rId20">
+                      <w14:nvContentPartPr>
+                        <w14:cNvContentPartPr/>
+                      </w14:nvContentPartPr>
+                      <w14:xfrm>
+                        <a:off x="0" y="0"/>
+                        <a:ext cx="492480" cy="6120"/>
+                      </w14:xfrm>
+                    </w14:contentPart>
+                  </a:graphicData>
+                </a:graphic>
+              </wp:anchor>
+            </w:drawing>
+          </mc:Choice>
+          <mc:Fallback>
+            <w:pict>
+              <v:shape w14:anchorId="7BFE84F8" id="Tinta 19" o:spid="_x0000_s1026" type="#_x0000_t75" style="position:absolute;margin-left:39.05pt;margin-top:62.7pt;width:39.8pt;height:1.5pt;z-index:251676672;visibility:visible;mso-wrap-style:square;mso-wrap-distance-left:9pt;mso-wrap-distance-top:0;mso-wrap-distance-right:9pt;mso-wrap-distance-bottom:0;mso-position-horizontal:absolute;mso-position-horizontal-relative:text;mso-position-vertical:absolute;mso-position-vertical-relative:text" o:gfxdata="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">
+                <v:imagedata r:id="rId21" o:title=""/>
+              </v:shape>
+            </w:pict>
+          </mc:Fallback>
+        </mc:AlternateContent>
+      </w:r>
+      <w:r>
+        <w:rPr>
+          <w:noProof/>
+        </w:rPr>
+        <mc:AlternateContent>
+          <mc:Choice Requires="wpi">
+            <w:drawing>
+              <wp:anchor distT="0" distB="0" distL="114300" distR="114300" simplePos="0" relativeHeight="251674624" behindDoc="0" locked="0" layoutInCell="1" allowOverlap="1" wp14:anchorId="34D3CB2E" wp14:editId="0ACAB616">
+                <wp:simplePos x="0" y="0"/>
+                <wp:positionH relativeFrom="column">
+                  <wp:posOffset>4687499</wp:posOffset>
+                </wp:positionH>
+                <wp:positionV relativeFrom="paragraph">
+                  <wp:posOffset>591637</wp:posOffset>
+                </wp:positionV>
+                <wp:extent cx="545040" cy="18360"/>
+                <wp:effectExtent l="38100" t="38100" r="45720" b="39370"/>
+                <wp:wrapNone/>
+                <wp:docPr id="785164123" name="Tinta 17"/>
+                <wp:cNvGraphicFramePr/>
+                <a:graphic xmlns:a="http://schemas.openxmlformats.org/drawingml/2006/main">
+                  <a:graphicData uri="http://schemas.microsoft.com/office/word/2010/wordprocessingInk">
+                    <w14:contentPart bwMode="auto" r:id="rId22">
+                      <w14:nvContentPartPr>
+                        <w14:cNvContentPartPr/>
+                      </w14:nvContentPartPr>
+                      <w14:xfrm>
+                        <a:off x="0" y="0"/>
+                        <a:ext cx="545040" cy="18360"/>
+                      </w14:xfrm>
+                    </w14:contentPart>
+                  </a:graphicData>
+                </a:graphic>
+              </wp:anchor>
+            </w:drawing>
+          </mc:Choice>
+          <mc:Fallback>
+            <w:pict>
+              <v:shape w14:anchorId="47FA2E26" id="Tinta 17" o:spid="_x0000_s1026" type="#_x0000_t75" style="position:absolute;margin-left:368.6pt;margin-top:46.1pt;width:43.9pt;height:2.45pt;z-index:251674624;visibility:visible;mso-wrap-style:square;mso-wrap-distance-left:9pt;mso-wrap-distance-top:0;mso-wrap-distance-right:9pt;mso-wrap-distance-bottom:0;mso-position-horizontal:absolute;mso-position-horizontal-relative:text;mso-position-vertical:absolute;mso-position-vertical-relative:text" o:gfxdata="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">
+                <v:imagedata r:id="rId23" o:title=""/>
+              </v:shape>
+            </w:pict>
+          </mc:Fallback>
+        </mc:AlternateContent>
+      </w:r>
+      <w:r>
+        <w:rPr>
+          <w:noProof/>
+        </w:rPr>
+        <mc:AlternateContent>
+          <mc:Choice Requires="wpi">
+            <w:drawing>
+              <wp:anchor distT="0" distB="0" distL="114300" distR="114300" simplePos="0" relativeHeight="251673600" behindDoc="0" locked="0" layoutInCell="1" allowOverlap="1" wp14:anchorId="1090FB6C" wp14:editId="67B938DF">
+                <wp:simplePos x="0" y="0"/>
+                <wp:positionH relativeFrom="column">
+                  <wp:posOffset>2753219</wp:posOffset>
+                </wp:positionH>
+                <wp:positionV relativeFrom="paragraph">
+                  <wp:posOffset>600997</wp:posOffset>
+                </wp:positionV>
+                <wp:extent cx="1198800" cy="20880"/>
+                <wp:effectExtent l="38100" t="38100" r="40005" b="36830"/>
+                <wp:wrapNone/>
+                <wp:docPr id="1387159887" name="Tinta 16"/>
+                <wp:cNvGraphicFramePr/>
+                <a:graphic xmlns:a="http://schemas.openxmlformats.org/drawingml/2006/main">
+                  <a:graphicData uri="http://schemas.microsoft.com/office/word/2010/wordprocessingInk">
+                    <w14:contentPart bwMode="auto" r:id="rId24">
+                      <w14:nvContentPartPr>
+                        <w14:cNvContentPartPr/>
+                      </w14:nvContentPartPr>
+                      <w14:xfrm>
+                        <a:off x="0" y="0"/>
+                        <a:ext cx="1198800" cy="20880"/>
+                      </w14:xfrm>
+                    </w14:contentPart>
+                  </a:graphicData>
+                </a:graphic>
+              </wp:anchor>
+            </w:drawing>
+          </mc:Choice>
+          <mc:Fallback>
+            <w:pict>
+              <v:shape w14:anchorId="2934B012" id="Tinta 16" o:spid="_x0000_s1026" type="#_x0000_t75" style="position:absolute;margin-left:216.3pt;margin-top:46.8pt;width:95.4pt;height:2.65pt;z-index:251673600;visibility:visible;mso-wrap-style:square;mso-wrap-distance-left:9pt;mso-wrap-distance-top:0;mso-wrap-distance-right:9pt;mso-wrap-distance-bottom:0;mso-position-horizontal:absolute;mso-position-horizontal-relative:text;mso-position-vertical:absolute;mso-position-vertical-relative:text" o:gfxdata="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">
+                <v:imagedata r:id="rId25" o:title=""/>
+              </v:shape>
+            </w:pict>
+          </mc:Fallback>
+        </mc:AlternateContent>
+      </w:r>
+      <w:r>
+        <w:rPr>
+          <w:noProof/>
+        </w:rPr>
+        <mc:AlternateContent>
+          <mc:Choice Requires="wpi">
+            <w:drawing>
+              <wp:anchor distT="0" distB="0" distL="114300" distR="114300" simplePos="0" relativeHeight="251672576" behindDoc="0" locked="0" layoutInCell="1" allowOverlap="1" wp14:anchorId="0B7D9DEB" wp14:editId="51872A90">
+                <wp:simplePos x="0" y="0"/>
+                <wp:positionH relativeFrom="column">
+                  <wp:posOffset>1381619</wp:posOffset>
+                </wp:positionH>
+                <wp:positionV relativeFrom="paragraph">
+                  <wp:posOffset>626917</wp:posOffset>
+                </wp:positionV>
+                <wp:extent cx="1122840" cy="6480"/>
+                <wp:effectExtent l="38100" t="38100" r="39370" b="50800"/>
+                <wp:wrapNone/>
+                <wp:docPr id="70221310" name="Tinta 15"/>
+                <wp:cNvGraphicFramePr/>
+                <a:graphic xmlns:a="http://schemas.openxmlformats.org/drawingml/2006/main">
+                  <a:graphicData uri="http://schemas.microsoft.com/office/word/2010/wordprocessingInk">
+                    <w14:contentPart bwMode="auto" r:id="rId26">
+                      <w14:nvContentPartPr>
+                        <w14:cNvContentPartPr/>
+                      </w14:nvContentPartPr>
+                      <w14:xfrm>
+                        <a:off x="0" y="0"/>
+                        <a:ext cx="1122840" cy="6480"/>
+                      </w14:xfrm>
+                    </w14:contentPart>
+                  </a:graphicData>
+                </a:graphic>
+              </wp:anchor>
+            </w:drawing>
+          </mc:Choice>
+          <mc:Fallback>
+            <w:pict>
+              <v:shape w14:anchorId="0F43DC09" id="Tinta 15" o:spid="_x0000_s1026" type="#_x0000_t75" style="position:absolute;margin-left:108.3pt;margin-top:48.85pt;width:89.4pt;height:1.45pt;z-index:251672576;visibility:visible;mso-wrap-style:square;mso-wrap-distance-left:9pt;mso-wrap-distance-top:0;mso-wrap-distance-right:9pt;mso-wrap-distance-bottom:0;mso-position-horizontal:absolute;mso-position-horizontal-relative:text;mso-position-vertical:absolute;mso-position-vertical-relative:text" o:gfxdata="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">
+                <v:imagedata r:id="rId27" o:title=""/>
+              </v:shape>
+            </w:pict>
+          </mc:Fallback>
+        </mc:AlternateContent>
+      </w:r>
+      <w:r>
+        <w:rPr>
+          <w:noProof/>
+        </w:rPr>
+        <mc:AlternateContent>
+          <mc:Choice Requires="wpi">
+            <w:drawing>
+              <wp:anchor distT="0" distB="0" distL="114300" distR="114300" simplePos="0" relativeHeight="251671552" behindDoc="0" locked="0" layoutInCell="1" allowOverlap="1" wp14:anchorId="44C27844" wp14:editId="4892703E">
+                <wp:simplePos x="0" y="0"/>
+                <wp:positionH relativeFrom="column">
+                  <wp:posOffset>2735219</wp:posOffset>
+                </wp:positionH>
+                <wp:positionV relativeFrom="paragraph">
+                  <wp:posOffset>398317</wp:posOffset>
+                </wp:positionV>
+                <wp:extent cx="1155240" cy="12240"/>
+                <wp:effectExtent l="38100" t="38100" r="45085" b="45085"/>
+                <wp:wrapNone/>
+                <wp:docPr id="860468693" name="Tinta 14"/>
+                <wp:cNvGraphicFramePr/>
+                <a:graphic xmlns:a="http://schemas.openxmlformats.org/drawingml/2006/main">
+                  <a:graphicData uri="http://schemas.microsoft.com/office/word/2010/wordprocessingInk">
+                    <w14:contentPart bwMode="auto" r:id="rId28">
+                      <w14:nvContentPartPr>
+                        <w14:cNvContentPartPr/>
+                      </w14:nvContentPartPr>
+                      <w14:xfrm>
+                        <a:off x="0" y="0"/>
+                        <a:ext cx="1155240" cy="12240"/>
+                      </w14:xfrm>
+                    </w14:contentPart>
+                  </a:graphicData>
+                </a:graphic>
+              </wp:anchor>
+            </w:drawing>
+          </mc:Choice>
+          <mc:Fallback>
+            <w:pict>
+              <v:shape w14:anchorId="73B8A05E" id="Tinta 14" o:spid="_x0000_s1026" type="#_x0000_t75" style="position:absolute;margin-left:214.85pt;margin-top:30.85pt;width:91.95pt;height:1.95pt;z-index:251671552;visibility:visible;mso-wrap-style:square;mso-wrap-distance-left:9pt;mso-wrap-distance-top:0;mso-wrap-distance-right:9pt;mso-wrap-distance-bottom:0;mso-position-horizontal:absolute;mso-position-horizontal-relative:text;mso-position-vertical:absolute;mso-position-vertical-relative:text" o:gfxdata="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">
+                <v:imagedata r:id="rId29" o:title=""/>
+              </v:shape>
+            </w:pict>
+          </mc:Fallback>
+        </mc:AlternateContent>
+      </w:r>
+      <w:r>
+        <w:rPr>
+          <w:noProof/>
+        </w:rPr>
+        <mc:AlternateContent>
+          <mc:Choice Requires="wpi">
+            <w:drawing>
+              <wp:anchor distT="0" distB="0" distL="114300" distR="114300" simplePos="0" relativeHeight="251669504" behindDoc="0" locked="0" layoutInCell="1" allowOverlap="1" wp14:anchorId="72CB4F5A" wp14:editId="1A14402C">
+                <wp:simplePos x="0" y="0"/>
+                <wp:positionH relativeFrom="column">
+                  <wp:posOffset>314579</wp:posOffset>
+                </wp:positionH>
+                <wp:positionV relativeFrom="paragraph">
+                  <wp:posOffset>603157</wp:posOffset>
+                </wp:positionV>
+                <wp:extent cx="844200" cy="18000"/>
+                <wp:effectExtent l="38100" t="38100" r="51435" b="39370"/>
+                <wp:wrapNone/>
+                <wp:docPr id="781901869" name="Tinta 12"/>
+                <wp:cNvGraphicFramePr/>
+                <a:graphic xmlns:a="http://schemas.openxmlformats.org/drawingml/2006/main">
+                  <a:graphicData uri="http://schemas.microsoft.com/office/word/2010/wordprocessingInk">
+                    <w14:contentPart bwMode="auto" r:id="rId30">
+                      <w14:nvContentPartPr>
+                        <w14:cNvContentPartPr/>
+                      </w14:nvContentPartPr>
+                      <w14:xfrm>
+                        <a:off x="0" y="0"/>
+                        <a:ext cx="844200" cy="18000"/>
+                      </w14:xfrm>
+                    </w14:contentPart>
+                  </a:graphicData>
+                </a:graphic>
+              </wp:anchor>
+            </w:drawing>
+          </mc:Choice>
+          <mc:Fallback>
+            <w:pict>
+              <v:shape w14:anchorId="5F73964A" id="Tinta 12" o:spid="_x0000_s1026" type="#_x0000_t75" style="position:absolute;margin-left:24.25pt;margin-top:47pt;width:67.45pt;height:2.4pt;z-index:251669504;visibility:visible;mso-wrap-style:square;mso-wrap-distance-left:9pt;mso-wrap-distance-top:0;mso-wrap-distance-right:9pt;mso-wrap-distance-bottom:0;mso-position-horizontal:absolute;mso-position-horizontal-relative:text;mso-position-vertical:absolute;mso-position-vertical-relative:text" o:gfxdata="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">
+                <v:imagedata r:id="rId31" o:title=""/>
+              </v:shape>
+            </w:pict>
+          </mc:Fallback>
+        </mc:AlternateContent>
+      </w:r>
+      <w:r>
+        <w:rPr>
+          <w:noProof/>
+        </w:rPr>
+        <mc:AlternateContent>
+          <mc:Choice Requires="wpi">
+            <w:drawing>
+              <wp:anchor distT="0" distB="0" distL="114300" distR="114300" simplePos="0" relativeHeight="251667456" behindDoc="0" locked="0" layoutInCell="1" allowOverlap="1" wp14:anchorId="09D6EEA0" wp14:editId="32901980">
+                <wp:simplePos x="0" y="0"/>
+                <wp:positionH relativeFrom="column">
+                  <wp:posOffset>1041779</wp:posOffset>
+                </wp:positionH>
+                <wp:positionV relativeFrom="paragraph">
+                  <wp:posOffset>410197</wp:posOffset>
+                </wp:positionV>
+                <wp:extent cx="844200" cy="17640"/>
+                <wp:effectExtent l="38100" t="38100" r="51435" b="40005"/>
+                <wp:wrapNone/>
+                <wp:docPr id="631291155" name="Tinta 10"/>
+                <wp:cNvGraphicFramePr/>
+                <a:graphic xmlns:a="http://schemas.openxmlformats.org/drawingml/2006/main">
+                  <a:graphicData uri="http://schemas.microsoft.com/office/word/2010/wordprocessingInk">
+                    <w14:contentPart bwMode="auto" r:id="rId32">
+                      <w14:nvContentPartPr>
+                        <w14:cNvContentPartPr/>
+                      </w14:nvContentPartPr>
+                      <w14:xfrm>
+                        <a:off x="0" y="0"/>
+                        <a:ext cx="844200" cy="17640"/>
+                      </w14:xfrm>
+                    </w14:contentPart>
+                  </a:graphicData>
+                </a:graphic>
+              </wp:anchor>
+            </w:drawing>
+          </mc:Choice>
+          <mc:Fallback>
+            <w:pict>
+              <v:shape w14:anchorId="47F82AFB" id="Tinta 10" o:spid="_x0000_s1026" type="#_x0000_t75" style="position:absolute;margin-left:81.55pt;margin-top:31.8pt;width:67.45pt;height:2.4pt;z-index:251667456;visibility:visible;mso-wrap-style:square;mso-wrap-distance-left:9pt;mso-wrap-distance-top:0;mso-wrap-distance-right:9pt;mso-wrap-distance-bottom:0;mso-position-horizontal:absolute;mso-position-horizontal-relative:text;mso-position-vertical:absolute;mso-position-vertical-relative:text" o:gfxdata="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">
+                <v:imagedata r:id="rId33" o:title=""/>
+              </v:shape>
+            </w:pict>
+          </mc:Fallback>
+        </mc:AlternateContent>
+      </w:r>
+      <w:r>
+        <w:rPr>
+          <w:noProof/>
+        </w:rPr>
+        <mc:AlternateContent>
+          <mc:Choice Requires="wpi">
+            <w:drawing>
+              <wp:anchor distT="0" distB="0" distL="114300" distR="114300" simplePos="0" relativeHeight="251665408" behindDoc="0" locked="0" layoutInCell="1" allowOverlap="1" wp14:anchorId="18AB9F9B" wp14:editId="6B1C2695">
+                <wp:simplePos x="0" y="0"/>
+                <wp:positionH relativeFrom="column">
+                  <wp:posOffset>976979</wp:posOffset>
+                </wp:positionH>
+                <wp:positionV relativeFrom="paragraph">
+                  <wp:posOffset>163957</wp:posOffset>
+                </wp:positionV>
+                <wp:extent cx="536760" cy="18000"/>
+                <wp:effectExtent l="38100" t="38100" r="34925" b="39370"/>
+                <wp:wrapNone/>
+                <wp:docPr id="1349516572" name="Tinta 8"/>
+                <wp:cNvGraphicFramePr/>
+                <a:graphic xmlns:a="http://schemas.openxmlformats.org/drawingml/2006/main">
+                  <a:graphicData uri="http://schemas.microsoft.com/office/word/2010/wordprocessingInk">
+                    <w14:contentPart bwMode="auto" r:id="rId34">
+                      <w14:nvContentPartPr>
+                        <w14:cNvContentPartPr/>
+                      </w14:nvContentPartPr>
+                      <w14:xfrm>
+                        <a:off x="0" y="0"/>
+                        <a:ext cx="536760" cy="18000"/>
+                      </w14:xfrm>
+                    </w14:contentPart>
+                  </a:graphicData>
+                </a:graphic>
+              </wp:anchor>
+            </w:drawing>
+          </mc:Choice>
+          <mc:Fallback>
+            <w:pict>
+              <v:shape w14:anchorId="7EB0FD94" id="Tinta 8" o:spid="_x0000_s1026" type="#_x0000_t75" style="position:absolute;margin-left:76.45pt;margin-top:12.4pt;width:43.25pt;height:2.4pt;z-index:251665408;visibility:visible;mso-wrap-style:square;mso-wrap-distance-left:9pt;mso-wrap-distance-top:0;mso-wrap-distance-right:9pt;mso-wrap-distance-bottom:0;mso-position-horizontal:absolute;mso-position-horizontal-relative:text;mso-position-vertical:absolute;mso-position-vertical-relative:text" o:gfxdata="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">
+                <v:imagedata r:id="rId35" o:title=""/>
+              </v:shape>
+            </w:pict>
+          </mc:Fallback>
+        </mc:AlternateContent>
+      </w:r>
+      <w:r>
+        <w:rPr>
+          <w:noProof/>
+        </w:rPr>
         <w:drawing>
           <wp:inline distT="0" distB="0" distL="0" distR="0" wp14:anchorId="31DB9B63" wp14:editId="40F083D2">
             <wp:extent cx="5400040" cy="806450"/>
@@ -98,7 +852,7 @@
                     <pic:cNvPicPr/>
                   </pic:nvPicPr>
                   <pic:blipFill>
-                    <a:blip r:embed="rId7"/>
+                    <a:blip r:embed="rId36"/>
                     <a:stretch>
                       <a:fillRect/>
                     </a:stretch>
@@ -121,6 +875,195 @@
     </w:p>
     <w:p>
       <w:r>
+        <w:rPr>
+          <w:noProof/>
+        </w:rPr>
+        <mc:AlternateContent>
+          <mc:Choice Requires="wpi">
+            <w:drawing>
+              <wp:anchor distT="0" distB="0" distL="114300" distR="114300" simplePos="0" relativeHeight="251685888" behindDoc="0" locked="0" layoutInCell="1" allowOverlap="1" wp14:anchorId="6DA20B94" wp14:editId="65F3FF46">
+                <wp:simplePos x="0" y="0"/>
+                <wp:positionH relativeFrom="column">
+                  <wp:posOffset>7172579</wp:posOffset>
+                </wp:positionH>
+                <wp:positionV relativeFrom="paragraph">
+                  <wp:posOffset>633577</wp:posOffset>
+                </wp:positionV>
+                <wp:extent cx="360" cy="360"/>
+                <wp:effectExtent l="38100" t="38100" r="38100" b="38100"/>
+                <wp:wrapNone/>
+                <wp:docPr id="720602979" name="Tinta 28"/>
+                <wp:cNvGraphicFramePr/>
+                <a:graphic xmlns:a="http://schemas.openxmlformats.org/drawingml/2006/main">
+                  <a:graphicData uri="http://schemas.microsoft.com/office/word/2010/wordprocessingInk">
+                    <w14:contentPart bwMode="auto" r:id="rId37">
+                      <w14:nvContentPartPr>
+                        <w14:cNvContentPartPr/>
+                      </w14:nvContentPartPr>
+                      <w14:xfrm>
+                        <a:off x="0" y="0"/>
+                        <a:ext cx="360" cy="360"/>
+                      </w14:xfrm>
+                    </w14:contentPart>
+                  </a:graphicData>
+                </a:graphic>
+              </wp:anchor>
+            </w:drawing>
+          </mc:Choice>
+          <mc:Fallback>
+            <w:pict>
+              <v:shape w14:anchorId="53F04230" id="Tinta 28" o:spid="_x0000_s1026" type="#_x0000_t75" style="position:absolute;margin-left:564.25pt;margin-top:49.4pt;width:1.05pt;height:1.05pt;z-index:251685888;visibility:visible;mso-wrap-style:square;mso-wrap-distance-left:9pt;mso-wrap-distance-top:0;mso-wrap-distance-right:9pt;mso-wrap-distance-bottom:0;mso-position-horizontal:absolute;mso-position-horizontal-relative:text;mso-position-vertical:absolute;mso-position-vertical-relative:text" o:gfxdata="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">
+                <v:imagedata r:id="rId8" o:title=""/>
+              </v:shape>
+            </w:pict>
+          </mc:Fallback>
+        </mc:AlternateContent>
+      </w:r>
+      <w:r>
+        <w:rPr>
+          <w:noProof/>
+        </w:rPr>
+        <mc:AlternateContent>
+          <mc:Choice Requires="wpi">
+            <w:drawing>
+              <wp:anchor distT="0" distB="0" distL="114300" distR="114300" simplePos="0" relativeHeight="251684864" behindDoc="0" locked="0" layoutInCell="1" allowOverlap="1" wp14:anchorId="3909EAC4" wp14:editId="42C93475">
+                <wp:simplePos x="0" y="0"/>
+                <wp:positionH relativeFrom="column">
+                  <wp:posOffset>7085099</wp:posOffset>
+                </wp:positionH>
+                <wp:positionV relativeFrom="paragraph">
+                  <wp:posOffset>393097</wp:posOffset>
+                </wp:positionV>
+                <wp:extent cx="360" cy="360"/>
+                <wp:effectExtent l="38100" t="38100" r="38100" b="38100"/>
+                <wp:wrapNone/>
+                <wp:docPr id="299111639" name="Tinta 27"/>
+                <wp:cNvGraphicFramePr/>
+                <a:graphic xmlns:a="http://schemas.openxmlformats.org/drawingml/2006/main">
+                  <a:graphicData uri="http://schemas.microsoft.com/office/word/2010/wordprocessingInk">
+                    <w14:contentPart bwMode="auto" r:id="rId38">
+                      <w14:nvContentPartPr>
+                        <w14:cNvContentPartPr/>
+                      </w14:nvContentPartPr>
+                      <w14:xfrm>
+                        <a:off x="0" y="0"/>
+                        <a:ext cx="360" cy="360"/>
+                      </w14:xfrm>
+                    </w14:contentPart>
+                  </a:graphicData>
+                </a:graphic>
+              </wp:anchor>
+            </w:drawing>
+          </mc:Choice>
+          <mc:Fallback>
+            <w:pict>
+              <v:shape w14:anchorId="186C1FBF" id="Tinta 27" o:spid="_x0000_s1026" type="#_x0000_t75" style="position:absolute;margin-left:557.4pt;margin-top:30.45pt;width:1.05pt;height:1.05pt;z-index:251684864;visibility:visible;mso-wrap-style:square;mso-wrap-distance-left:9pt;mso-wrap-distance-top:0;mso-wrap-distance-right:9pt;mso-wrap-distance-bottom:0;mso-position-horizontal:absolute;mso-position-horizontal-relative:text;mso-position-vertical:absolute;mso-position-vertical-relative:text" o:gfxdata="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">
+                <v:imagedata r:id="rId8" o:title=""/>
+              </v:shape>
+            </w:pict>
+          </mc:Fallback>
+        </mc:AlternateContent>
+      </w:r>
+      <w:r>
+        <w:rPr>
+          <w:noProof/>
+        </w:rPr>
+        <mc:AlternateContent>
+          <mc:Choice Requires="wpi">
+            <w:drawing>
+              <wp:anchor distT="0" distB="0" distL="114300" distR="114300" simplePos="0" relativeHeight="251680768" behindDoc="0" locked="0" layoutInCell="1" allowOverlap="1" wp14:anchorId="066FC386" wp14:editId="4B80AD43">
+                <wp:simplePos x="0" y="0"/>
+                <wp:positionH relativeFrom="column">
+                  <wp:posOffset>2724059</wp:posOffset>
+                </wp:positionH>
+                <wp:positionV relativeFrom="paragraph">
+                  <wp:posOffset>350257</wp:posOffset>
+                </wp:positionV>
+                <wp:extent cx="2371680" cy="48960"/>
+                <wp:effectExtent l="38100" t="38100" r="48260" b="46355"/>
+                <wp:wrapNone/>
+                <wp:docPr id="1268641430" name="Tinta 23"/>
+                <wp:cNvGraphicFramePr/>
+                <a:graphic xmlns:a="http://schemas.openxmlformats.org/drawingml/2006/main">
+                  <a:graphicData uri="http://schemas.microsoft.com/office/word/2010/wordprocessingInk">
+                    <w14:contentPart bwMode="auto" r:id="rId39">
+                      <w14:nvContentPartPr>
+                        <w14:cNvContentPartPr/>
+                      </w14:nvContentPartPr>
+                      <w14:xfrm>
+                        <a:off x="0" y="0"/>
+                        <a:ext cx="2371680" cy="48960"/>
+                      </w14:xfrm>
+                    </w14:contentPart>
+                  </a:graphicData>
+                </a:graphic>
+              </wp:anchor>
+            </w:drawing>
+          </mc:Choice>
+          <mc:Fallback>
+            <w:pict>
+              <v:shape w14:anchorId="4E059A63" id="Tinta 23" o:spid="_x0000_s1026" type="#_x0000_t75" style="position:absolute;margin-left:214pt;margin-top:27.1pt;width:187.75pt;height:4.8pt;z-index:251680768;visibility:visible;mso-wrap-style:square;mso-wrap-distance-left:9pt;mso-wrap-distance-top:0;mso-wrap-distance-right:9pt;mso-wrap-distance-bottom:0;mso-position-horizontal:absolute;mso-position-horizontal-relative:text;mso-position-vertical:absolute;mso-position-vertical-relative:text" o:gfxdata="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">
+                <v:imagedata r:id="rId40" o:title=""/>
+              </v:shape>
+            </w:pict>
+          </mc:Fallback>
+        </mc:AlternateContent>
+      </w:r>
+      <w:r>
+        <w:rPr>
+          <w:noProof/>
+        </w:rPr>
+        <mc:AlternateContent>
+          <mc:Choice Requires="wpi">
+            <w:drawing>
+              <wp:anchor distT="0" distB="0" distL="114300" distR="114300" simplePos="0" relativeHeight="251679744" behindDoc="0" locked="0" layoutInCell="1" allowOverlap="1" wp14:anchorId="1B345981" wp14:editId="4ADBA318">
+                <wp:simplePos x="0" y="0"/>
+                <wp:positionH relativeFrom="column">
+                  <wp:posOffset>1967339</wp:posOffset>
+                </wp:positionH>
+                <wp:positionV relativeFrom="paragraph">
+                  <wp:posOffset>199777</wp:posOffset>
+                </wp:positionV>
+                <wp:extent cx="2510155" cy="635"/>
+                <wp:effectExtent l="38100" t="38100" r="42545" b="37465"/>
+                <wp:wrapNone/>
+                <wp:docPr id="1401010926" name="Tinta 22"/>
+                <wp:cNvGraphicFramePr/>
+                <a:graphic xmlns:a="http://schemas.openxmlformats.org/drawingml/2006/main">
+                  <a:graphicData uri="http://schemas.microsoft.com/office/word/2010/wordprocessingInk">
+                    <w14:contentPart bwMode="auto" r:id="rId41">
+                      <w14:nvContentPartPr>
+                        <w14:cNvContentPartPr/>
+                      </w14:nvContentPartPr>
+                      <w14:xfrm>
+                        <a:off x="0" y="0"/>
+                        <a:ext cx="2510155" cy="635"/>
+                      </w14:xfrm>
+                    </w14:contentPart>
+                  </a:graphicData>
+                </a:graphic>
+                <wp14:sizeRelH relativeFrom="margin">
+                  <wp14:pctWidth>0</wp14:pctWidth>
+                </wp14:sizeRelH>
+                <wp14:sizeRelV relativeFrom="margin">
+                  <wp14:pctHeight>0</wp14:pctHeight>
+                </wp14:sizeRelV>
+              </wp:anchor>
+            </w:drawing>
+          </mc:Choice>
+          <mc:Fallback>
+            <w:pict>
+              <v:shape w14:anchorId="11D9EA85" id="Tinta 22" o:spid="_x0000_s1026" type="#_x0000_t75" style="position:absolute;margin-left:154.4pt;margin-top:14.9pt;width:198.6pt;height:1.75pt;z-index:251679744;visibility:visible;mso-wrap-style:square;mso-width-percent:0;mso-height-percent:0;mso-wrap-distance-left:9pt;mso-wrap-distance-top:0;mso-wrap-distance-right:9pt;mso-wrap-distance-bottom:0;mso-position-horizontal:absolute;mso-position-horizontal-relative:text;mso-position-vertical:absolute;mso-position-vertical-relative:text;mso-width-percent:0;mso-height-percent:0;mso-width-relative:margin;mso-height-relative:margin" o:gfxdata="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">
+                <v:imagedata r:id="rId42" o:title=""/>
+              </v:shape>
+            </w:pict>
+          </mc:Fallback>
+        </mc:AlternateContent>
+      </w:r>
+      <w:r>
+        <w:rPr>
+          <w:noProof/>
+        </w:rPr>
         <w:drawing>
           <wp:inline distT="0" distB="0" distL="0" distR="0" wp14:anchorId="7E634857" wp14:editId="68E0162B">
             <wp:extent cx="5400040" cy="605790"/>
@@ -137,7 +1080,7 @@
                     <pic:cNvPicPr/>
                   </pic:nvPicPr>
                   <pic:blipFill>
-                    <a:blip r:embed="rId8"/>
+                    <a:blip r:embed="rId43"/>
                     <a:stretch>
                       <a:fillRect/>
                     </a:stretch>
@@ -160,6 +1103,99 @@
     </w:p>
     <w:p>
       <w:r>
+        <w:rPr>
+          <w:noProof/>
+        </w:rPr>
+        <mc:AlternateContent>
+          <mc:Choice Requires="wpi">
+            <w:drawing>
+              <wp:anchor distT="0" distB="0" distL="114300" distR="114300" simplePos="0" relativeHeight="251689984" behindDoc="0" locked="0" layoutInCell="1" allowOverlap="1" wp14:anchorId="3421F7E5" wp14:editId="61074DF5">
+                <wp:simplePos x="0" y="0"/>
+                <wp:positionH relativeFrom="column">
+                  <wp:posOffset>7682699</wp:posOffset>
+                </wp:positionH>
+                <wp:positionV relativeFrom="paragraph">
+                  <wp:posOffset>676732</wp:posOffset>
+                </wp:positionV>
+                <wp:extent cx="360" cy="1440"/>
+                <wp:effectExtent l="38100" t="38100" r="38100" b="36830"/>
+                <wp:wrapNone/>
+                <wp:docPr id="1460928181" name="Tinta 32"/>
+                <wp:cNvGraphicFramePr/>
+                <a:graphic xmlns:a="http://schemas.openxmlformats.org/drawingml/2006/main">
+                  <a:graphicData uri="http://schemas.microsoft.com/office/word/2010/wordprocessingInk">
+                    <w14:contentPart bwMode="auto" r:id="rId44">
+                      <w14:nvContentPartPr>
+                        <w14:cNvContentPartPr/>
+                      </w14:nvContentPartPr>
+                      <w14:xfrm>
+                        <a:off x="0" y="0"/>
+                        <a:ext cx="360" cy="1440"/>
+                      </w14:xfrm>
+                    </w14:contentPart>
+                  </a:graphicData>
+                </a:graphic>
+              </wp:anchor>
+            </w:drawing>
+          </mc:Choice>
+          <mc:Fallback>
+            <w:pict>
+              <v:shape w14:anchorId="07629948" id="Tinta 32" o:spid="_x0000_s1026" type="#_x0000_t75" style="position:absolute;margin-left:604.45pt;margin-top:52.8pt;width:1.05pt;height:1.1pt;z-index:251689984;visibility:visible;mso-wrap-style:square;mso-wrap-distance-left:9pt;mso-wrap-distance-top:0;mso-wrap-distance-right:9pt;mso-wrap-distance-bottom:0;mso-position-horizontal:absolute;mso-position-horizontal-relative:text;mso-position-vertical:absolute;mso-position-vertical-relative:text" o:gfxdata="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">
+                <v:imagedata r:id="rId45" o:title=""/>
+              </v:shape>
+            </w:pict>
+          </mc:Fallback>
+        </mc:AlternateContent>
+      </w:r>
+      <w:r>
+        <w:rPr>
+          <w:noProof/>
+        </w:rPr>
+        <mc:AlternateContent>
+          <mc:Choice Requires="wpi">
+            <w:drawing>
+              <wp:anchor distT="0" distB="0" distL="114300" distR="114300" simplePos="0" relativeHeight="251683840" behindDoc="0" locked="0" layoutInCell="1" allowOverlap="1" wp14:anchorId="2D34F694" wp14:editId="131E50BB">
+                <wp:simplePos x="0" y="0"/>
+                <wp:positionH relativeFrom="column">
+                  <wp:posOffset>2395379</wp:posOffset>
+                </wp:positionH>
+                <wp:positionV relativeFrom="paragraph">
+                  <wp:posOffset>185212</wp:posOffset>
+                </wp:positionV>
+                <wp:extent cx="1952280" cy="6120"/>
+                <wp:effectExtent l="38100" t="38100" r="48260" b="51435"/>
+                <wp:wrapNone/>
+                <wp:docPr id="1143664398" name="Tinta 26"/>
+                <wp:cNvGraphicFramePr/>
+                <a:graphic xmlns:a="http://schemas.openxmlformats.org/drawingml/2006/main">
+                  <a:graphicData uri="http://schemas.microsoft.com/office/word/2010/wordprocessingInk">
+                    <w14:contentPart bwMode="auto" r:id="rId46">
+                      <w14:nvContentPartPr>
+                        <w14:cNvContentPartPr/>
+                      </w14:nvContentPartPr>
+                      <w14:xfrm>
+                        <a:off x="0" y="0"/>
+                        <a:ext cx="1952280" cy="6120"/>
+                      </w14:xfrm>
+                    </w14:contentPart>
+                  </a:graphicData>
+                </a:graphic>
+              </wp:anchor>
+            </w:drawing>
+          </mc:Choice>
+          <mc:Fallback>
+            <w:pict>
+              <v:shape w14:anchorId="510CAD89" id="Tinta 26" o:spid="_x0000_s1026" type="#_x0000_t75" style="position:absolute;margin-left:188.1pt;margin-top:14.1pt;width:154.7pt;height:1.5pt;z-index:251683840;visibility:visible;mso-wrap-style:square;mso-wrap-distance-left:9pt;mso-wrap-distance-top:0;mso-wrap-distance-right:9pt;mso-wrap-distance-bottom:0;mso-position-horizontal:absolute;mso-position-horizontal-relative:text;mso-position-vertical:absolute;mso-position-vertical-relative:text" o:gfxdata="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">
+                <v:imagedata r:id="rId47" o:title=""/>
+              </v:shape>
+            </w:pict>
+          </mc:Fallback>
+        </mc:AlternateContent>
+      </w:r>
+      <w:r>
+        <w:rPr>
+          <w:noProof/>
+        </w:rPr>
         <w:drawing>
           <wp:inline distT="0" distB="0" distL="0" distR="0" wp14:anchorId="5885FB68" wp14:editId="56336649">
             <wp:extent cx="5400040" cy="623570"/>
@@ -176,7 +1212,7 @@
                     <pic:cNvPicPr/>
                   </pic:nvPicPr>
                   <pic:blipFill>
-                    <a:blip r:embed="rId9"/>
+                    <a:blip r:embed="rId48"/>
                     <a:stretch>
                       <a:fillRect/>
                     </a:stretch>
@@ -199,6 +1235,105 @@
     </w:p>
     <w:p>
       <w:r>
+        <w:rPr>
+          <w:noProof/>
+        </w:rPr>
+        <mc:AlternateContent>
+          <mc:Choice Requires="wpi">
+            <w:drawing>
+              <wp:anchor distT="0" distB="0" distL="114300" distR="114300" simplePos="0" relativeHeight="251688960" behindDoc="0" locked="0" layoutInCell="1" allowOverlap="1" wp14:anchorId="25B72540" wp14:editId="76F9AA5C">
+                <wp:simplePos x="0" y="0"/>
+                <wp:positionH relativeFrom="column">
+                  <wp:posOffset>332579</wp:posOffset>
+                </wp:positionH>
+                <wp:positionV relativeFrom="paragraph">
+                  <wp:posOffset>643392</wp:posOffset>
+                </wp:positionV>
+                <wp:extent cx="351360" cy="26640"/>
+                <wp:effectExtent l="38100" t="38100" r="48895" b="50165"/>
+                <wp:wrapNone/>
+                <wp:docPr id="316659104" name="Tinta 31"/>
+                <wp:cNvGraphicFramePr/>
+                <a:graphic xmlns:a="http://schemas.openxmlformats.org/drawingml/2006/main">
+                  <a:graphicData uri="http://schemas.microsoft.com/office/word/2010/wordprocessingInk">
+                    <w14:contentPart bwMode="auto" r:id="rId49">
+                      <w14:nvContentPartPr>
+                        <w14:cNvContentPartPr/>
+                      </w14:nvContentPartPr>
+                      <w14:xfrm>
+                        <a:off x="0" y="0"/>
+                        <a:ext cx="351360" cy="26640"/>
+                      </w14:xfrm>
+                    </w14:contentPart>
+                  </a:graphicData>
+                </a:graphic>
+              </wp:anchor>
+            </w:drawing>
+          </mc:Choice>
+          <mc:Fallback>
+            <w:pict>
+              <v:shape w14:anchorId="3AF985DB" id="Tinta 31" o:spid="_x0000_s1026" type="#_x0000_t75" style="position:absolute;margin-left:25.7pt;margin-top:50.15pt;width:28.65pt;height:3.1pt;z-index:251688960;visibility:visible;mso-wrap-style:square;mso-wrap-distance-left:9pt;mso-wrap-distance-top:0;mso-wrap-distance-right:9pt;mso-wrap-distance-bottom:0;mso-position-horizontal:absolute;mso-position-horizontal-relative:text;mso-position-vertical:absolute;mso-position-vertical-relative:text" o:gfxdata="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">
+                <v:imagedata r:id="rId50" o:title=""/>
+              </v:shape>
+            </w:pict>
+          </mc:Fallback>
+        </mc:AlternateContent>
+      </w:r>
+      <w:r>
+        <w:rPr>
+          <w:noProof/>
+        </w:rPr>
+        <mc:AlternateContent>
+          <mc:Choice Requires="wpi">
+            <w:drawing>
+              <wp:anchor distT="0" distB="0" distL="114300" distR="114300" simplePos="0" relativeHeight="251687936" behindDoc="0" locked="0" layoutInCell="1" allowOverlap="1" wp14:anchorId="2593FF5A" wp14:editId="36A045F7">
+                <wp:simplePos x="0" y="0"/>
+                <wp:positionH relativeFrom="column">
+                  <wp:posOffset>4001699</wp:posOffset>
+                </wp:positionH>
+                <wp:positionV relativeFrom="paragraph">
+                  <wp:posOffset>422352</wp:posOffset>
+                </wp:positionV>
+                <wp:extent cx="1248410" cy="635"/>
+                <wp:effectExtent l="38100" t="38100" r="46990" b="37465"/>
+                <wp:wrapNone/>
+                <wp:docPr id="279301950" name="Tinta 30"/>
+                <wp:cNvGraphicFramePr/>
+                <a:graphic xmlns:a="http://schemas.openxmlformats.org/drawingml/2006/main">
+                  <a:graphicData uri="http://schemas.microsoft.com/office/word/2010/wordprocessingInk">
+                    <w14:contentPart bwMode="auto" r:id="rId51">
+                      <w14:nvContentPartPr>
+                        <w14:cNvContentPartPr/>
+                      </w14:nvContentPartPr>
+                      <w14:xfrm>
+                        <a:off x="0" y="0"/>
+                        <a:ext cx="1248410" cy="635"/>
+                      </w14:xfrm>
+                    </w14:contentPart>
+                  </a:graphicData>
+                </a:graphic>
+                <wp14:sizeRelH relativeFrom="margin">
+                  <wp14:pctWidth>0</wp14:pctWidth>
+                </wp14:sizeRelH>
+                <wp14:sizeRelV relativeFrom="margin">
+                  <wp14:pctHeight>0</wp14:pctHeight>
+                </wp14:sizeRelV>
+              </wp:anchor>
+            </w:drawing>
+          </mc:Choice>
+          <mc:Fallback>
+            <w:pict>
+              <v:shape w14:anchorId="51E79123" id="Tinta 30" o:spid="_x0000_s1026" type="#_x0000_t75" style="position:absolute;margin-left:314.6pt;margin-top:32.4pt;width:99.25pt;height:1.75pt;z-index:251687936;visibility:visible;mso-wrap-style:square;mso-width-percent:0;mso-height-percent:0;mso-wrap-distance-left:9pt;mso-wrap-distance-top:0;mso-wrap-distance-right:9pt;mso-wrap-distance-bottom:0;mso-position-horizontal:absolute;mso-position-horizontal-relative:text;mso-position-vertical:absolute;mso-position-vertical-relative:text;mso-width-percent:0;mso-height-percent:0;mso-width-relative:margin;mso-height-relative:margin" o:gfxdata="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">
+                <v:imagedata r:id="rId52" o:title=""/>
+              </v:shape>
+            </w:pict>
+          </mc:Fallback>
+        </mc:AlternateContent>
+      </w:r>
+      <w:r>
+        <w:rPr>
+          <w:noProof/>
+        </w:rPr>
         <w:drawing>
           <wp:inline distT="0" distB="0" distL="0" distR="0" wp14:anchorId="117552E6" wp14:editId="507F760C">
             <wp:extent cx="5400040" cy="839470"/>
@@ -215,7 +1350,7 @@
                     <pic:cNvPicPr/>
                   </pic:nvPicPr>
                   <pic:blipFill>
-                    <a:blip r:embed="rId10"/>
+                    <a:blip r:embed="rId53"/>
                     <a:stretch>
                       <a:fillRect/>
                     </a:stretch>
@@ -324,7 +1459,7 @@
     <w:p>
       <w:r>
         <w:pict w14:anchorId="37C0DA62">
-          <v:rect id="_x0000_i1079" style="width:0;height:1.5pt" o:hralign="center" o:hrstd="t" o:hr="t" fillcolor="#a0a0a0" stroked="f"/>
+          <v:rect id="_x0000_i1025" style="width:0;height:1.5pt" o:hralign="center" o:hrstd="t" o:hr="t" fillcolor="#a0a0a0" stroked="f"/>
         </w:pict>
       </w:r>
     </w:p>
@@ -554,19 +1689,11 @@
               <w:rPr>
                 <w:rFonts w:ascii="Segoe UI Emoji" w:hAnsi="Segoe UI Emoji" w:cs="Segoe UI Emoji"/>
               </w:rPr>
-              <w:t>✔</w:t>
-            </w:r>
-            <w:proofErr w:type="gramStart"/>
-            <w:r>
-              <w:rPr>
-                <w:rFonts w:ascii="Segoe UI Emoji" w:hAnsi="Segoe UI Emoji" w:cs="Segoe UI Emoji"/>
-              </w:rPr>
-              <w:t>️</w:t>
+              <w:t>✔️</w:t>
             </w:r>
             <w:r>
               <w:t xml:space="preserve"> Excelente</w:t>
             </w:r>
-            <w:proofErr w:type="gramEnd"/>
           </w:p>
         </w:tc>
       </w:tr>
@@ -637,19 +1764,11 @@
               <w:rPr>
                 <w:rFonts w:ascii="Segoe UI Emoji" w:hAnsi="Segoe UI Emoji" w:cs="Segoe UI Emoji"/>
               </w:rPr>
-              <w:t>✔</w:t>
-            </w:r>
-            <w:proofErr w:type="gramStart"/>
-            <w:r>
-              <w:rPr>
-                <w:rFonts w:ascii="Segoe UI Emoji" w:hAnsi="Segoe UI Emoji" w:cs="Segoe UI Emoji"/>
-              </w:rPr>
-              <w:t>️</w:t>
+              <w:t>✔️</w:t>
             </w:r>
             <w:r>
               <w:t xml:space="preserve"> Completa</w:t>
             </w:r>
-            <w:proofErr w:type="gramEnd"/>
           </w:p>
         </w:tc>
       </w:tr>
@@ -720,19 +1839,11 @@
               <w:rPr>
                 <w:rFonts w:ascii="Segoe UI Emoji" w:hAnsi="Segoe UI Emoji" w:cs="Segoe UI Emoji"/>
               </w:rPr>
-              <w:t>✔</w:t>
-            </w:r>
-            <w:proofErr w:type="gramStart"/>
-            <w:r>
-              <w:rPr>
-                <w:rFonts w:ascii="Segoe UI Emoji" w:hAnsi="Segoe UI Emoji" w:cs="Segoe UI Emoji"/>
-              </w:rPr>
-              <w:t>️</w:t>
+              <w:t>✔️</w:t>
             </w:r>
             <w:r>
               <w:t xml:space="preserve"> Profunda e realista</w:t>
             </w:r>
-            <w:proofErr w:type="gramEnd"/>
           </w:p>
         </w:tc>
       </w:tr>
@@ -878,19 +1989,11 @@
               <w:rPr>
                 <w:rFonts w:ascii="Segoe UI Emoji" w:hAnsi="Segoe UI Emoji" w:cs="Segoe UI Emoji"/>
               </w:rPr>
-              <w:t>✔</w:t>
-            </w:r>
-            <w:proofErr w:type="gramStart"/>
-            <w:r>
-              <w:rPr>
-                <w:rFonts w:ascii="Segoe UI Emoji" w:hAnsi="Segoe UI Emoji" w:cs="Segoe UI Emoji"/>
-              </w:rPr>
-              <w:t>️</w:t>
+              <w:t>✔️</w:t>
             </w:r>
             <w:r>
               <w:t xml:space="preserve"> Fundamentada</w:t>
             </w:r>
-            <w:proofErr w:type="gramEnd"/>
           </w:p>
         </w:tc>
       </w:tr>
@@ -973,7 +2076,7 @@
     <w:p>
       <w:r>
         <w:pict w14:anchorId="7C86BF69">
-          <v:rect id="_x0000_i1080" style="width:0;height:1.5pt" o:hralign="center" o:hrstd="t" o:hr="t" fillcolor="#a0a0a0" stroked="f"/>
+          <v:rect id="_x0000_i1026" style="width:0;height:1.5pt" o:hralign="center" o:hrstd="t" o:hr="t" fillcolor="#a0a0a0" stroked="f"/>
         </w:pict>
       </w:r>
     </w:p>
@@ -1020,21 +2123,10 @@
         <w:rPr>
           <w:rFonts w:ascii="Segoe UI Emoji" w:hAnsi="Segoe UI Emoji" w:cs="Segoe UI Emoji"/>
         </w:rPr>
-        <w:t>✔</w:t>
-      </w:r>
-      <w:proofErr w:type="gramStart"/>
-      <w:r>
-        <w:rPr>
-          <w:rFonts w:ascii="Segoe UI Emoji" w:hAnsi="Segoe UI Emoji" w:cs="Segoe UI Emoji"/>
-        </w:rPr>
-        <w:t>️</w:t>
-      </w:r>
-      <w:r>
-        <w:t xml:space="preserve"> Perfeita</w:t>
-      </w:r>
-      <w:proofErr w:type="gramEnd"/>
-      <w:r>
-        <w:t>. Ela define o programa da tese, propõe um framework novo e estabelece seu diferencial teórico.</w:t>
+        <w:t>✔️</w:t>
+      </w:r>
+      <w:r>
+        <w:t xml:space="preserve"> Perfeita. Ela define o programa da tese, propõe um framework novo e estabelece seu diferencial teórico.</w:t>
       </w:r>
     </w:p>
     <w:p>
@@ -1084,7 +2176,7 @@
     <w:p>
       <w:r>
         <w:pict w14:anchorId="586A08DE">
-          <v:rect id="_x0000_i1081" style="width:0;height:1.5pt" o:hralign="center" o:hrstd="t" o:hr="t" fillcolor="#a0a0a0" stroked="f"/>
+          <v:rect id="_x0000_i1027" style="width:0;height:1.5pt" o:hralign="center" o:hrstd="t" o:hr="t" fillcolor="#a0a0a0" stroked="f"/>
         </w:pict>
       </w:r>
     </w:p>
@@ -1111,20 +2203,7 @@
         <w:t>✔️</w:t>
       </w:r>
       <w:r>
-        <w:t xml:space="preserve"> Muito sólida e técnica. </w:t>
-      </w:r>
-      <w:proofErr w:type="spellStart"/>
-      <w:proofErr w:type="gramStart"/>
-      <w:r>
-        <w:t>Coloca</w:t>
-      </w:r>
-      <w:proofErr w:type="spellEnd"/>
-      <w:r>
-        <w:t xml:space="preserve"> o dedo na ferida</w:t>
-      </w:r>
-      <w:proofErr w:type="gramEnd"/>
-      <w:r>
-        <w:t xml:space="preserve"> teórica: a exclusão do meio ambiente distorce incentivos e instituições.</w:t>
+        <w:t xml:space="preserve"> Muito sólida e técnica. Coloca o dedo na ferida teórica: a exclusão do meio ambiente distorce incentivos e instituições.</w:t>
       </w:r>
     </w:p>
     <w:p>
@@ -1146,15 +2225,7 @@
         <w:t>Sugestão fina (opcional)</w:t>
       </w:r>
       <w:r>
-        <w:t>: trocar “</w:t>
-      </w:r>
-      <w:proofErr w:type="spellStart"/>
-      <w:r>
-        <w:t>towards</w:t>
-      </w:r>
-      <w:proofErr w:type="spellEnd"/>
-      <w:r>
-        <w:t>” por “for” para dar mais ênfase à finalidade normativa:</w:t>
+        <w:t>: trocar “towards” por “for” para dar mais ênfase à finalidade normativa:</w:t>
       </w:r>
     </w:p>
     <w:p>
@@ -1173,7 +2244,7 @@
     <w:p>
       <w:r>
         <w:pict w14:anchorId="76E311E0">
-          <v:rect id="_x0000_i1082" style="width:0;height:1.5pt" o:hralign="center" o:hrstd="t" o:hr="t" fillcolor="#a0a0a0" stroked="f"/>
+          <v:rect id="_x0000_i1028" style="width:0;height:1.5pt" o:hralign="center" o:hrstd="t" o:hr="t" fillcolor="#a0a0a0" stroked="f"/>
         </w:pict>
       </w:r>
     </w:p>
@@ -1221,21 +2292,8 @@
           <w:numId w:val="2"/>
         </w:numPr>
       </w:pPr>
-      <w:proofErr w:type="spellStart"/>
-      <w:r>
-        <w:t>Bounded</w:t>
-      </w:r>
-      <w:proofErr w:type="spellEnd"/>
-      <w:r>
-        <w:t xml:space="preserve"> </w:t>
-      </w:r>
-      <w:proofErr w:type="spellStart"/>
-      <w:r>
-        <w:t>rationality</w:t>
-      </w:r>
-      <w:proofErr w:type="spellEnd"/>
-      <w:r>
-        <w:t xml:space="preserve"> → Bayes e Kalman</w:t>
+      <w:r>
+        <w:t>Bounded rationality → Bayes e Kalman</w:t>
       </w:r>
     </w:p>
     <w:p>
@@ -1246,15 +2304,7 @@
         </w:numPr>
       </w:pPr>
       <w:r>
-        <w:t xml:space="preserve">Random </w:t>
-      </w:r>
-      <w:proofErr w:type="spellStart"/>
-      <w:r>
-        <w:t>shocks</w:t>
-      </w:r>
-      <w:proofErr w:type="spellEnd"/>
-      <w:r>
-        <w:t xml:space="preserve"> → Markov</w:t>
+        <w:t>Random shocks → Markov</w:t>
       </w:r>
     </w:p>
     <w:p>
@@ -1265,15 +2315,7 @@
         </w:numPr>
       </w:pPr>
       <w:r>
-        <w:t xml:space="preserve">Social </w:t>
-      </w:r>
-      <w:proofErr w:type="spellStart"/>
-      <w:r>
-        <w:t>interactions</w:t>
-      </w:r>
-      <w:proofErr w:type="spellEnd"/>
-      <w:r>
-        <w:t xml:space="preserve"> → Spin</w:t>
+        <w:t>Social interactions → Spin</w:t>
       </w:r>
     </w:p>
     <w:p>
@@ -1308,7 +2350,7 @@
     <w:p>
       <w:r>
         <w:pict w14:anchorId="0031A76E">
-          <v:rect id="_x0000_i1083" style="width:0;height:1.5pt" o:hralign="center" o:hrstd="t" o:hr="t" fillcolor="#a0a0a0" stroked="f"/>
+          <v:rect id="_x0000_i1029" style="width:0;height:1.5pt" o:hralign="center" o:hrstd="t" o:hr="t" fillcolor="#a0a0a0" stroked="f"/>
         </w:pict>
       </w:r>
     </w:p>
@@ -1353,206 +2395,142 @@
           <w:b/>
           <w:bCs/>
         </w:rPr>
-        <w:t>Sugestão estilística (se quiser evitar “</w:t>
-      </w:r>
-      <w:proofErr w:type="spellStart"/>
-      <w:r>
+        <w:t>Sugestão estilística (se quiser evitar “induce”):</w:t>
+      </w:r>
+    </w:p>
+    <w:p>
+      <w:pPr>
+        <w:rPr>
+          <w:lang w:val="en-US"/>
+        </w:rPr>
+      </w:pPr>
+      <w:r>
+        <w:rPr>
+          <w:lang w:val="en-US"/>
+        </w:rPr>
+        <w:t>...can effectively encourage agents to internalize...</w:t>
+      </w:r>
+    </w:p>
+    <w:p>
+      <w:pPr>
+        <w:rPr>
+          <w:lang w:val="en-US"/>
+        </w:rPr>
+      </w:pPr>
+      <w:r>
+        <w:rPr>
+          <w:lang w:val="en-US"/>
+        </w:rPr>
+        <w:t>Ou:</w:t>
+      </w:r>
+    </w:p>
+    <w:p>
+      <w:pPr>
+        <w:rPr>
+          <w:lang w:val="en-US"/>
+        </w:rPr>
+      </w:pPr>
+      <w:r>
+        <w:rPr>
+          <w:lang w:val="en-US"/>
+        </w:rPr>
+        <w:t>...can lead agents to internalize environmental preservation...</w:t>
+      </w:r>
+    </w:p>
+    <w:p>
+      <w:r>
+        <w:pict w14:anchorId="0BF0CD8D">
+          <v:rect id="_x0000_i1030" style="width:0;height:1.5pt" o:hralign="center" o:hrstd="t" o:hr="t" fillcolor="#a0a0a0" stroked="f"/>
+        </w:pict>
+      </w:r>
+    </w:p>
+    <w:p>
+      <w:pPr>
         <w:rPr>
           <w:b/>
           <w:bCs/>
         </w:rPr>
-        <w:t>induce</w:t>
-      </w:r>
-      <w:proofErr w:type="spellEnd"/>
+      </w:pPr>
       <w:r>
         <w:rPr>
           <w:b/>
           <w:bCs/>
         </w:rPr>
-        <w:t>”):</w:t>
-      </w:r>
-    </w:p>
-    <w:p>
-      <w:pPr>
-        <w:rPr>
-          <w:lang w:val="en-US"/>
-        </w:rPr>
-      </w:pPr>
-      <w:r>
-        <w:rPr>
-          <w:lang w:val="en-US"/>
-        </w:rPr>
-        <w:t>...can effectively encourage agents to internalize...</w:t>
-      </w:r>
-    </w:p>
-    <w:p>
-      <w:pPr>
-        <w:rPr>
-          <w:lang w:val="en-US"/>
-        </w:rPr>
-      </w:pPr>
-      <w:r>
-        <w:rPr>
-          <w:lang w:val="en-US"/>
-        </w:rPr>
-        <w:t>Ou:</w:t>
-      </w:r>
-    </w:p>
-    <w:p>
-      <w:pPr>
-        <w:rPr>
-          <w:lang w:val="en-US"/>
-        </w:rPr>
-      </w:pPr>
-      <w:r>
-        <w:rPr>
-          <w:lang w:val="en-US"/>
-        </w:rPr>
-        <w:t>...can lead agents to internalize environmental preservation...</w:t>
-      </w:r>
-    </w:p>
-    <w:p>
-      <w:r>
-        <w:pict w14:anchorId="0BF0CD8D">
-          <v:rect id="_x0000_i1084" style="width:0;height:1.5pt" o:hralign="center" o:hrstd="t" o:hr="t" fillcolor="#a0a0a0" stroked="f"/>
-        </w:pict>
-      </w:r>
-    </w:p>
-    <w:p>
-      <w:pPr>
+        <w:t>### H4 – Incentivos devem respeitar contextos ecológicos</w:t>
+      </w:r>
+    </w:p>
+    <w:p>
+      <w:r>
+        <w:rPr>
+          <w:rFonts w:ascii="Segoe UI Emoji" w:hAnsi="Segoe UI Emoji" w:cs="Segoe UI Emoji"/>
+        </w:rPr>
+        <w:t>✔️</w:t>
+      </w:r>
+      <w:r>
+        <w:t xml:space="preserve"> Uma das mais importantes para sua tese. Amarra o argumento da compensação local (vs. global) e diferencia sua proposta de soluções genéricas.</w:t>
+      </w:r>
+    </w:p>
+    <w:p>
+      <w:r>
+        <w:rPr>
+          <w:rFonts w:ascii="Segoe UI Emoji" w:hAnsi="Segoe UI Emoji" w:cs="Segoe UI Emoji"/>
+        </w:rPr>
+        <w:t>🔁</w:t>
+      </w:r>
+      <w:r>
+        <w:t xml:space="preserve"> </w:t>
+      </w:r>
+      <w:r>
         <w:rPr>
           <w:b/>
           <w:bCs/>
         </w:rPr>
-      </w:pPr>
-      <w:r>
+        <w:t>Sugestão (reforço técnico, opcional):</w:t>
+      </w:r>
+    </w:p>
+    <w:p>
+      <w:pPr>
+        <w:rPr>
+          <w:lang w:val="en-US"/>
+        </w:rPr>
+      </w:pPr>
+      <w:r>
+        <w:rPr>
+          <w:lang w:val="en-US"/>
+        </w:rPr>
+        <w:t>...must be spatially and ecologically differentiated...</w:t>
+      </w:r>
+    </w:p>
+    <w:p>
+      <w:r>
+        <w:t>Ou acrescentar algo como:</w:t>
+      </w:r>
+    </w:p>
+    <w:p>
+      <w:r>
+        <w:t>...to prevent ecological dumping and asymmetric environmental burdens.</w:t>
+      </w:r>
+    </w:p>
+    <w:p>
+      <w:r>
+        <w:lastRenderedPageBreak/>
+        <w:pict w14:anchorId="300A629B">
+          <v:rect id="_x0000_i1031" style="width:0;height:1.5pt" o:hralign="center" o:hrstd="t" o:hr="t" fillcolor="#a0a0a0" stroked="f"/>
+        </w:pict>
+      </w:r>
+    </w:p>
+    <w:p>
+      <w:pPr>
         <w:rPr>
           <w:b/>
           <w:bCs/>
         </w:rPr>
-        <w:t>### H4 – Incentivos devem respeitar contextos ecológicos</w:t>
-      </w:r>
-    </w:p>
-    <w:p>
-      <w:r>
-        <w:rPr>
-          <w:rFonts w:ascii="Segoe UI Emoji" w:hAnsi="Segoe UI Emoji" w:cs="Segoe UI Emoji"/>
-        </w:rPr>
-        <w:t>✔️</w:t>
-      </w:r>
-      <w:r>
-        <w:t xml:space="preserve"> Uma das mais importantes para sua tese. Amarra o argumento da compensação local (vs. global) e diferencia sua proposta de soluções genéricas.</w:t>
-      </w:r>
-    </w:p>
-    <w:p>
-      <w:r>
-        <w:rPr>
-          <w:rFonts w:ascii="Segoe UI Emoji" w:hAnsi="Segoe UI Emoji" w:cs="Segoe UI Emoji"/>
-        </w:rPr>
-        <w:t>🔁</w:t>
-      </w:r>
-      <w:r>
-        <w:t xml:space="preserve"> </w:t>
-      </w:r>
+      </w:pPr>
       <w:r>
         <w:rPr>
           <w:b/>
           <w:bCs/>
         </w:rPr>
-        <w:t>Sugestão (reforço técnico, opcional):</w:t>
-      </w:r>
-    </w:p>
-    <w:p>
-      <w:pPr>
-        <w:rPr>
-          <w:lang w:val="en-US"/>
-        </w:rPr>
-      </w:pPr>
-      <w:r>
-        <w:rPr>
-          <w:lang w:val="en-US"/>
-        </w:rPr>
-        <w:t>...must be spatially and ecologically differentiated...</w:t>
-      </w:r>
-    </w:p>
-    <w:p>
-      <w:r>
-        <w:t>Ou acrescentar algo como:</w:t>
-      </w:r>
-    </w:p>
-    <w:p>
-      <w:r>
-        <w:t>...</w:t>
-      </w:r>
-      <w:proofErr w:type="spellStart"/>
-      <w:r>
-        <w:t>to</w:t>
-      </w:r>
-      <w:proofErr w:type="spellEnd"/>
-      <w:r>
-        <w:t xml:space="preserve"> </w:t>
-      </w:r>
-      <w:proofErr w:type="spellStart"/>
-      <w:r>
-        <w:t>prevent</w:t>
-      </w:r>
-      <w:proofErr w:type="spellEnd"/>
-      <w:r>
-        <w:t xml:space="preserve"> </w:t>
-      </w:r>
-      <w:proofErr w:type="spellStart"/>
-      <w:r>
-        <w:t>ecological</w:t>
-      </w:r>
-      <w:proofErr w:type="spellEnd"/>
-      <w:r>
-        <w:t xml:space="preserve"> dumping and </w:t>
-      </w:r>
-      <w:proofErr w:type="spellStart"/>
-      <w:r>
-        <w:t>asymmetric</w:t>
-      </w:r>
-      <w:proofErr w:type="spellEnd"/>
-      <w:r>
-        <w:t xml:space="preserve"> </w:t>
-      </w:r>
-      <w:proofErr w:type="spellStart"/>
-      <w:r>
-        <w:t>environmental</w:t>
-      </w:r>
-      <w:proofErr w:type="spellEnd"/>
-      <w:r>
-        <w:t xml:space="preserve"> </w:t>
-      </w:r>
-      <w:proofErr w:type="spellStart"/>
-      <w:r>
-        <w:t>burdens</w:t>
-      </w:r>
-      <w:proofErr w:type="spellEnd"/>
-      <w:r>
-        <w:t>.</w:t>
-      </w:r>
-    </w:p>
-    <w:p>
-      <w:r>
-        <w:lastRenderedPageBreak/>
-        <w:pict w14:anchorId="300A629B">
-          <v:rect id="_x0000_i1085" style="width:0;height:1.5pt" o:hralign="center" o:hrstd="t" o:hr="t" fillcolor="#a0a0a0" stroked="f"/>
-        </w:pict>
-      </w:r>
-    </w:p>
-    <w:p>
-      <w:pPr>
-        <w:rPr>
-          <w:b/>
-          <w:bCs/>
-        </w:rPr>
-      </w:pPr>
-      <w:r>
-        <w:rPr>
-          <w:b/>
-          <w:bCs/>
-        </w:rPr>
         <w:t>### H5 – Emergência de um novo equilíbrio de Nash</w:t>
       </w:r>
     </w:p>
@@ -1561,21 +2539,10 @@
         <w:rPr>
           <w:rFonts w:ascii="Segoe UI Emoji" w:hAnsi="Segoe UI Emoji" w:cs="Segoe UI Emoji"/>
         </w:rPr>
-        <w:t>✔</w:t>
-      </w:r>
-      <w:proofErr w:type="gramStart"/>
-      <w:r>
-        <w:rPr>
-          <w:rFonts w:ascii="Segoe UI Emoji" w:hAnsi="Segoe UI Emoji" w:cs="Segoe UI Emoji"/>
-        </w:rPr>
-        <w:t>️</w:t>
-      </w:r>
-      <w:r>
-        <w:t xml:space="preserve"> Genial</w:t>
-      </w:r>
-      <w:proofErr w:type="gramEnd"/>
-      <w:r>
-        <w:t xml:space="preserve"> como corolário lógico das anteriores. Faz sentido matemático e político. Traz sua tese à condição de </w:t>
+        <w:t>✔️</w:t>
+      </w:r>
+      <w:r>
+        <w:t xml:space="preserve"> Genial como corolário lógico das anteriores. Faz sentido matemático e político. Traz sua tese à condição de </w:t>
       </w:r>
       <w:r>
         <w:rPr>
@@ -1624,15 +2591,7 @@
     </w:p>
     <w:p>
       <w:r>
-        <w:t>\item[\</w:t>
-      </w:r>
-      <w:proofErr w:type="spellStart"/>
-      <w:r>
-        <w:t>textbf</w:t>
-      </w:r>
-      <w:proofErr w:type="spellEnd"/>
-      <w:r>
-        <w:t xml:space="preserve">{H5.}] </w:t>
+        <w:t xml:space="preserve">\item[\textbf{H5.}] </w:t>
       </w:r>
     </w:p>
     <w:p>
@@ -1645,29 +2604,7 @@
         <w:rPr>
           <w:lang w:val="en-US"/>
         </w:rPr>
-        <w:t>\</w:t>
-      </w:r>
-      <w:proofErr w:type="spellStart"/>
-      <w:proofErr w:type="gramStart"/>
-      <w:r>
-        <w:rPr>
-          <w:lang w:val="en-US"/>
-        </w:rPr>
-        <w:t>textit</w:t>
-      </w:r>
-      <w:proofErr w:type="spellEnd"/>
-      <w:r>
-        <w:rPr>
-          <w:lang w:val="en-US"/>
-        </w:rPr>
-        <w:t>{</w:t>
-      </w:r>
-      <w:proofErr w:type="gramEnd"/>
-      <w:r>
-        <w:rPr>
-          <w:lang w:val="en-US"/>
-        </w:rPr>
-        <w:t>Under conditions of ecological feedback, bounded rationality, and well-calibrated incentives, interactions among economic agents tend to converge toward a stable strategic equilibrium in which environmental preservation becomes individually rational and collectively optimal.}</w:t>
+        <w:t>\textit{Under conditions of ecological feedback, bounded rationality, and well-calibrated incentives, interactions among economic agents tend to converge toward a stable strategic equilibrium in which environmental preservation becomes individually rational and collectively optimal.}</w:t>
       </w:r>
     </w:p>
     <w:p>
@@ -1678,31 +2615,7 @@
         <w:t>✔️</w:t>
       </w:r>
       <w:r>
-        <w:t xml:space="preserve"> “</w:t>
-      </w:r>
-      <w:proofErr w:type="spellStart"/>
-      <w:r>
-        <w:t>Tend</w:t>
-      </w:r>
-      <w:proofErr w:type="spellEnd"/>
-      <w:r>
-        <w:t xml:space="preserve"> </w:t>
-      </w:r>
-      <w:proofErr w:type="spellStart"/>
-      <w:r>
-        <w:t>to</w:t>
-      </w:r>
-      <w:proofErr w:type="spellEnd"/>
-      <w:r>
-        <w:t xml:space="preserve"> converge </w:t>
-      </w:r>
-      <w:proofErr w:type="spellStart"/>
-      <w:r>
-        <w:t>toward</w:t>
-      </w:r>
-      <w:proofErr w:type="spellEnd"/>
-      <w:r>
-        <w:t>...” reforça o processo dinâmico.</w:t>
+        <w:t xml:space="preserve"> “Tend to converge toward...” reforça o processo dinâmico.</w:t>
       </w:r>
       <w:r>
         <w:br/>
@@ -1714,29 +2627,13 @@
         <w:t>✔️</w:t>
       </w:r>
       <w:r>
-        <w:t xml:space="preserve"> “</w:t>
-      </w:r>
-      <w:proofErr w:type="spellStart"/>
-      <w:r>
-        <w:t>Well-calibrated</w:t>
-      </w:r>
-      <w:proofErr w:type="spellEnd"/>
-      <w:r>
-        <w:t>” é mais comum do que “</w:t>
-      </w:r>
-      <w:proofErr w:type="spellStart"/>
-      <w:r>
-        <w:t>calibrated</w:t>
-      </w:r>
-      <w:proofErr w:type="spellEnd"/>
-      <w:r>
-        <w:t>” isolado em economia aplicada.</w:t>
+        <w:t xml:space="preserve"> “Well-calibrated” é mais comum do que “calibrated” isolado em economia aplicada.</w:t>
       </w:r>
     </w:p>
     <w:p>
       <w:r>
         <w:pict w14:anchorId="1975A7FF">
-          <v:rect id="_x0000_i1086" style="width:0;height:1.5pt" o:hralign="center" o:hrstd="t" o:hr="t" fillcolor="#a0a0a0" stroked="f"/>
+          <v:rect id="_x0000_i1032" style="width:0;height:1.5pt" o:hralign="center" o:hrstd="t" o:hr="t" fillcolor="#a0a0a0" stroked="f"/>
         </w:pict>
       </w:r>
     </w:p>
@@ -1760,23 +2657,7 @@
           <w:b/>
           <w:bCs/>
         </w:rPr>
-        <w:t xml:space="preserve"> ALGO IMPORTANTE FICOU DE </w:t>
-      </w:r>
-      <w:proofErr w:type="gramStart"/>
-      <w:r>
-        <w:rPr>
-          <w:b/>
-          <w:bCs/>
-        </w:rPr>
-        <w:t>FORA</w:t>
-      </w:r>
-      <w:proofErr w:type="gramEnd"/>
-      <w:r>
-        <w:rPr>
-          <w:b/>
-          <w:bCs/>
-        </w:rPr>
-        <w:t>?</w:t>
+        <w:t xml:space="preserve"> ALGO IMPORTANTE FICOU DE FORA?</w:t>
       </w:r>
     </w:p>
     <w:p>
@@ -1819,17 +2700,8 @@
           <w:b/>
           <w:bCs/>
         </w:rPr>
-        <w:t xml:space="preserve">problema teórico da </w:t>
-      </w:r>
-      <w:proofErr w:type="spellStart"/>
-      <w:r>
-        <w:rPr>
-          <w:b/>
-          <w:bCs/>
-        </w:rPr>
-        <w:t>exogenia</w:t>
-      </w:r>
-      <w:proofErr w:type="spellEnd"/>
+        <w:t>problema teórico da exogenia</w:t>
+      </w:r>
       <w:r>
         <w:t xml:space="preserve"> (H1)</w:t>
       </w:r>
@@ -1921,7 +2793,7 @@
     <w:p>
       <w:r>
         <w:pict w14:anchorId="51BAA81B">
-          <v:rect id="_x0000_i1087" style="width:0;height:1.5pt" o:hralign="center" o:hrstd="t" o:hr="t" fillcolor="#a0a0a0" stroked="f"/>
+          <v:rect id="_x0000_i1033" style="width:0;height:1.5pt" o:hralign="center" o:hrstd="t" o:hr="t" fillcolor="#a0a0a0" stroked="f"/>
         </w:pict>
       </w:r>
     </w:p>
@@ -2066,15 +2938,7 @@
     </w:p>
     <w:p>
       <w:r>
-        <w:t xml:space="preserve">Se desejar, posso gerar a versão final completa em </w:t>
-      </w:r>
-      <w:proofErr w:type="spellStart"/>
-      <w:r>
-        <w:t>LaTeX</w:t>
-      </w:r>
-      <w:proofErr w:type="spellEnd"/>
-      <w:r>
-        <w:t xml:space="preserve"> (comentada, revisada, pronta para a tese). Deseja isso?</w:t>
+        <w:t>Se desejar, posso gerar a versão final completa em LaTeX (comentada, revisada, pronta para a tese). Deseja isso?</w:t>
       </w:r>
     </w:p>
     <w:p/>
@@ -3268,6 +4132,7 @@
   <w:style w:type="character" w:default="1" w:styleId="Fontepargpadro">
     <w:name w:val="Default Paragraph Font"/>
     <w:uiPriority w:val="1"/>
+    <w:semiHidden/>
     <w:unhideWhenUsed/>
   </w:style>
   <w:style w:type="table" w:default="1" w:styleId="Tabelanormal">
@@ -3584,6 +4449,678 @@
 </w:styles>
 </file>
 
+<file path=word/ink/ink1.xml><?xml version="1.0" encoding="utf-8"?>
+<inkml:ink xmlns:inkml="http://www.w3.org/2003/InkML">
+  <inkml:definitions>
+    <inkml:context xml:id="ctx0">
+      <inkml:inkSource xml:id="inkSrc0">
+        <inkml:traceFormat>
+          <inkml:channel name="X" type="integer" min="-2.14748E9" max="2.14748E9" units="cm"/>
+          <inkml:channel name="Y" type="integer" min="-2.14748E9" max="2.14748E9" units="cm"/>
+          <inkml:channel name="F" type="integer" max="32767" units="dev"/>
+        </inkml:traceFormat>
+        <inkml:channelProperties>
+          <inkml:channelProperty channel="X" name="resolution" value="1000" units="1/cm"/>
+          <inkml:channelProperty channel="Y" name="resolution" value="1000" units="1/cm"/>
+          <inkml:channelProperty channel="F" name="resolution" value="0" units="1/dev"/>
+        </inkml:channelProperties>
+      </inkml:inkSource>
+      <inkml:timestamp xml:id="ts0" timeString="2025-05-20T15:51:03.464"/>
+    </inkml:context>
+    <inkml:brush xml:id="br0">
+      <inkml:brushProperty name="width" value="0.035" units="cm"/>
+      <inkml:brushProperty name="height" value="0.035" units="cm"/>
+      <inkml:brushProperty name="color" value="#004F8B"/>
+    </inkml:brush>
+  </inkml:definitions>
+  <inkml:trace contextRef="#ctx0" brushRef="#br0">0 0 24575,'0'0'-8191</inkml:trace>
+</inkml:ink>
+</file>
+
+<file path=word/ink/ink10.xml><?xml version="1.0" encoding="utf-8"?>
+<inkml:ink xmlns:inkml="http://www.w3.org/2003/InkML">
+  <inkml:definitions>
+    <inkml:context xml:id="ctx0">
+      <inkml:inkSource xml:id="inkSrc0">
+        <inkml:traceFormat>
+          <inkml:channel name="X" type="integer" min="-2.14748E9" max="2.14748E9" units="cm"/>
+          <inkml:channel name="Y" type="integer" min="-2.14748E9" max="2.14748E9" units="cm"/>
+          <inkml:channel name="F" type="integer" max="32767" units="dev"/>
+        </inkml:traceFormat>
+        <inkml:channelProperties>
+          <inkml:channelProperty channel="X" name="resolution" value="1000" units="1/cm"/>
+          <inkml:channelProperty channel="Y" name="resolution" value="1000" units="1/cm"/>
+          <inkml:channelProperty channel="F" name="resolution" value="0" units="1/dev"/>
+        </inkml:channelProperties>
+      </inkml:inkSource>
+      <inkml:timestamp xml:id="ts0" timeString="2025-05-20T15:48:37.696"/>
+    </inkml:context>
+    <inkml:brush xml:id="br0">
+      <inkml:brushProperty name="width" value="0.035" units="cm"/>
+      <inkml:brushProperty name="height" value="0.035" units="cm"/>
+      <inkml:brushProperty name="color" value="#E71224"/>
+    </inkml:brush>
+  </inkml:definitions>
+  <inkml:trace contextRef="#ctx0" brushRef="#br0">0 50 24575,'133'-8'0,"6"-1"0,-81 7 0,72-12 0,46-3 0,687 18-1365,-848-1-5461</inkml:trace>
+</inkml:ink>
+</file>
+
+<file path=word/ink/ink11.xml><?xml version="1.0" encoding="utf-8"?>
+<inkml:ink xmlns:inkml="http://www.w3.org/2003/InkML">
+  <inkml:definitions>
+    <inkml:context xml:id="ctx0">
+      <inkml:inkSource xml:id="inkSrc0">
+        <inkml:traceFormat>
+          <inkml:channel name="X" type="integer" min="-2.14748E9" max="2.14748E9" units="cm"/>
+          <inkml:channel name="Y" type="integer" min="-2.14748E9" max="2.14748E9" units="cm"/>
+          <inkml:channel name="F" type="integer" max="32767" units="dev"/>
+        </inkml:traceFormat>
+        <inkml:channelProperties>
+          <inkml:channelProperty channel="X" name="resolution" value="1000" units="1/cm"/>
+          <inkml:channelProperty channel="Y" name="resolution" value="1000" units="1/cm"/>
+          <inkml:channelProperty channel="F" name="resolution" value="0" units="1/dev"/>
+        </inkml:channelProperties>
+      </inkml:inkSource>
+      <inkml:timestamp xml:id="ts0" timeString="2025-05-20T15:48:34.687"/>
+    </inkml:context>
+    <inkml:brush xml:id="br0">
+      <inkml:brushProperty name="width" value="0.035" units="cm"/>
+      <inkml:brushProperty name="height" value="0.035" units="cm"/>
+      <inkml:brushProperty name="color" value="#E71224"/>
+    </inkml:brush>
+  </inkml:definitions>
+  <inkml:trace contextRef="#ctx0" brushRef="#br0">0 40 24575,'1496'0'0,"-1391"9"0,6-1 0,1060-8 0,-1106-9 0,0 1 0,-15 7 0,63-10 0,-73 6-60,-15 2-375,-1-1 0,30-8 0,-44 8-6391</inkml:trace>
+</inkml:ink>
+</file>
+
+<file path=word/ink/ink12.xml><?xml version="1.0" encoding="utf-8"?>
+<inkml:ink xmlns:inkml="http://www.w3.org/2003/InkML">
+  <inkml:definitions>
+    <inkml:context xml:id="ctx0">
+      <inkml:inkSource xml:id="inkSrc0">
+        <inkml:traceFormat>
+          <inkml:channel name="X" type="integer" min="-2.14748E9" max="2.14748E9" units="cm"/>
+          <inkml:channel name="Y" type="integer" min="-2.14748E9" max="2.14748E9" units="cm"/>
+          <inkml:channel name="F" type="integer" max="32767" units="dev"/>
+        </inkml:traceFormat>
+        <inkml:channelProperties>
+          <inkml:channelProperty channel="X" name="resolution" value="1000" units="1/cm"/>
+          <inkml:channelProperty channel="Y" name="resolution" value="1000" units="1/cm"/>
+          <inkml:channelProperty channel="F" name="resolution" value="0" units="1/dev"/>
+        </inkml:channelProperties>
+      </inkml:inkSource>
+      <inkml:timestamp xml:id="ts0" timeString="2025-05-20T15:48:29.515"/>
+    </inkml:context>
+    <inkml:brush xml:id="br0">
+      <inkml:brushProperty name="width" value="0.035" units="cm"/>
+      <inkml:brushProperty name="height" value="0.035" units="cm"/>
+      <inkml:brushProperty name="color" value="#E71224"/>
+    </inkml:brush>
+  </inkml:definitions>
+  <inkml:trace contextRef="#ctx0" brushRef="#br0">0 1 24575,'1819'0'0,"-1719"8"0,2 1 0,956-10 0,-1029-2-1365,-19-1-5461</inkml:trace>
+</inkml:ink>
+</file>
+
+<file path=word/ink/ink13.xml><?xml version="1.0" encoding="utf-8"?>
+<inkml:ink xmlns:inkml="http://www.w3.org/2003/InkML">
+  <inkml:definitions>
+    <inkml:context xml:id="ctx0">
+      <inkml:inkSource xml:id="inkSrc0">
+        <inkml:traceFormat>
+          <inkml:channel name="X" type="integer" min="-2.14748E9" max="2.14748E9" units="cm"/>
+          <inkml:channel name="Y" type="integer" min="-2.14748E9" max="2.14748E9" units="cm"/>
+          <inkml:channel name="F" type="integer" max="32767" units="dev"/>
+        </inkml:traceFormat>
+        <inkml:channelProperties>
+          <inkml:channelProperty channel="X" name="resolution" value="1000" units="1/cm"/>
+          <inkml:channelProperty channel="Y" name="resolution" value="1000" units="1/cm"/>
+          <inkml:channelProperty channel="F" name="resolution" value="0" units="1/dev"/>
+        </inkml:channelProperties>
+      </inkml:inkSource>
+      <inkml:timestamp xml:id="ts0" timeString="2025-05-20T15:48:27.253"/>
+    </inkml:context>
+    <inkml:brush xml:id="br0">
+      <inkml:brushProperty name="width" value="0.035" units="cm"/>
+      <inkml:brushProperty name="height" value="0.035" units="cm"/>
+      <inkml:brushProperty name="color" value="#E71224"/>
+    </inkml:brush>
+  </inkml:definitions>
+  <inkml:trace contextRef="#ctx0" brushRef="#br0">1 0 24145,'3208'33'0</inkml:trace>
+</inkml:ink>
+</file>
+
+<file path=word/ink/ink14.xml><?xml version="1.0" encoding="utf-8"?>
+<inkml:ink xmlns:inkml="http://www.w3.org/2003/InkML">
+  <inkml:definitions>
+    <inkml:context xml:id="ctx0">
+      <inkml:inkSource xml:id="inkSrc0">
+        <inkml:traceFormat>
+          <inkml:channel name="X" type="integer" min="-2.14748E9" max="2.14748E9" units="cm"/>
+          <inkml:channel name="Y" type="integer" min="-2.14748E9" max="2.14748E9" units="cm"/>
+          <inkml:channel name="F" type="integer" max="32767" units="dev"/>
+        </inkml:traceFormat>
+        <inkml:channelProperties>
+          <inkml:channelProperty channel="X" name="resolution" value="1000" units="1/cm"/>
+          <inkml:channelProperty channel="Y" name="resolution" value="1000" units="1/cm"/>
+          <inkml:channelProperty channel="F" name="resolution" value="0" units="1/dev"/>
+        </inkml:channelProperties>
+      </inkml:inkSource>
+      <inkml:timestamp xml:id="ts0" timeString="2025-05-20T15:48:24.659"/>
+    </inkml:context>
+    <inkml:brush xml:id="br0">
+      <inkml:brushProperty name="width" value="0.035" units="cm"/>
+      <inkml:brushProperty name="height" value="0.035" units="cm"/>
+      <inkml:brushProperty name="color" value="#E71224"/>
+    </inkml:brush>
+  </inkml:definitions>
+  <inkml:trace contextRef="#ctx0" brushRef="#br0">1 1 24119,'2344'49'0</inkml:trace>
+</inkml:ink>
+</file>
+
+<file path=word/ink/ink15.xml><?xml version="1.0" encoding="utf-8"?>
+<inkml:ink xmlns:inkml="http://www.w3.org/2003/InkML">
+  <inkml:definitions>
+    <inkml:context xml:id="ctx0">
+      <inkml:inkSource xml:id="inkSrc0">
+        <inkml:traceFormat>
+          <inkml:channel name="X" type="integer" min="-2.14748E9" max="2.14748E9" units="cm"/>
+          <inkml:channel name="Y" type="integer" min="-2.14748E9" max="2.14748E9" units="cm"/>
+          <inkml:channel name="F" type="integer" max="32767" units="dev"/>
+        </inkml:traceFormat>
+        <inkml:channelProperties>
+          <inkml:channelProperty channel="X" name="resolution" value="1000" units="1/cm"/>
+          <inkml:channelProperty channel="Y" name="resolution" value="1000" units="1/cm"/>
+          <inkml:channelProperty channel="F" name="resolution" value="0" units="1/dev"/>
+        </inkml:channelProperties>
+      </inkml:inkSource>
+      <inkml:timestamp xml:id="ts0" timeString="2025-05-20T15:48:19.797"/>
+    </inkml:context>
+    <inkml:brush xml:id="br0">
+      <inkml:brushProperty name="width" value="0.035" units="cm"/>
+      <inkml:brushProperty name="height" value="0.035" units="cm"/>
+      <inkml:brushProperty name="color" value="#E71224"/>
+    </inkml:brush>
+  </inkml:definitions>
+  <inkml:trace contextRef="#ctx0" brushRef="#br0">0 48 24401,'2344'-48'0</inkml:trace>
+</inkml:ink>
+</file>
+
+<file path=word/ink/ink16.xml><?xml version="1.0" encoding="utf-8"?>
+<inkml:ink xmlns:inkml="http://www.w3.org/2003/InkML">
+  <inkml:definitions>
+    <inkml:context xml:id="ctx0">
+      <inkml:inkSource xml:id="inkSrc0">
+        <inkml:traceFormat>
+          <inkml:channel name="X" type="integer" min="-2.14748E9" max="2.14748E9" units="cm"/>
+          <inkml:channel name="Y" type="integer" min="-2.14748E9" max="2.14748E9" units="cm"/>
+          <inkml:channel name="F" type="integer" max="32767" units="dev"/>
+        </inkml:traceFormat>
+        <inkml:channelProperties>
+          <inkml:channelProperty channel="X" name="resolution" value="1000" units="1/cm"/>
+          <inkml:channelProperty channel="Y" name="resolution" value="1000" units="1/cm"/>
+          <inkml:channelProperty channel="F" name="resolution" value="0" units="1/dev"/>
+        </inkml:channelProperties>
+      </inkml:inkSource>
+      <inkml:timestamp xml:id="ts0" timeString="2025-05-20T15:48:17.059"/>
+    </inkml:context>
+    <inkml:brush xml:id="br0">
+      <inkml:brushProperty name="width" value="0.035" units="cm"/>
+      <inkml:brushProperty name="height" value="0.035" units="cm"/>
+      <inkml:brushProperty name="color" value="#E71224"/>
+    </inkml:brush>
+  </inkml:definitions>
+  <inkml:trace contextRef="#ctx0" brushRef="#br0">1 49 24575,'24'-1'0,"0"-1"0,0-2 0,28-6 0,7-2 0,32 1 0,179 2 0,-211 10 0,788-1 0,-818 2-1365,-19 2-5461</inkml:trace>
+</inkml:ink>
+</file>
+
+<file path=word/ink/ink17.xml><?xml version="1.0" encoding="utf-8"?>
+<inkml:ink xmlns:inkml="http://www.w3.org/2003/InkML">
+  <inkml:definitions>
+    <inkml:context xml:id="ctx0">
+      <inkml:inkSource xml:id="inkSrc0">
+        <inkml:traceFormat>
+          <inkml:channel name="X" type="integer" min="-2.14748E9" max="2.14748E9" units="cm"/>
+          <inkml:channel name="Y" type="integer" min="-2.14748E9" max="2.14748E9" units="cm"/>
+          <inkml:channel name="F" type="integer" max="32767" units="dev"/>
+        </inkml:traceFormat>
+        <inkml:channelProperties>
+          <inkml:channelProperty channel="X" name="resolution" value="1000" units="1/cm"/>
+          <inkml:channelProperty channel="Y" name="resolution" value="1000" units="1/cm"/>
+          <inkml:channelProperty channel="F" name="resolution" value="0" units="1/dev"/>
+        </inkml:channelProperties>
+      </inkml:inkSource>
+      <inkml:timestamp xml:id="ts0" timeString="2025-05-20T15:49:34.406"/>
+    </inkml:context>
+    <inkml:brush xml:id="br0">
+      <inkml:brushProperty name="width" value="0.035" units="cm"/>
+      <inkml:brushProperty name="height" value="0.035" units="cm"/>
+      <inkml:brushProperty name="color" value="#E71224"/>
+    </inkml:brush>
+  </inkml:definitions>
+  <inkml:trace contextRef="#ctx0" brushRef="#br0">1 0 24575,'0'0'-8191</inkml:trace>
+</inkml:ink>
+</file>
+
+<file path=word/ink/ink18.xml><?xml version="1.0" encoding="utf-8"?>
+<inkml:ink xmlns:inkml="http://www.w3.org/2003/InkML">
+  <inkml:definitions>
+    <inkml:context xml:id="ctx0">
+      <inkml:inkSource xml:id="inkSrc0">
+        <inkml:traceFormat>
+          <inkml:channel name="X" type="integer" min="-2.14748E9" max="2.14748E9" units="cm"/>
+          <inkml:channel name="Y" type="integer" min="-2.14748E9" max="2.14748E9" units="cm"/>
+          <inkml:channel name="F" type="integer" max="32767" units="dev"/>
+        </inkml:traceFormat>
+        <inkml:channelProperties>
+          <inkml:channelProperty channel="X" name="resolution" value="1000" units="1/cm"/>
+          <inkml:channelProperty channel="Y" name="resolution" value="1000" units="1/cm"/>
+          <inkml:channelProperty channel="F" name="resolution" value="0" units="1/dev"/>
+        </inkml:channelProperties>
+      </inkml:inkSource>
+      <inkml:timestamp xml:id="ts0" timeString="2025-05-20T15:49:27.470"/>
+    </inkml:context>
+    <inkml:brush xml:id="br0">
+      <inkml:brushProperty name="width" value="0.035" units="cm"/>
+      <inkml:brushProperty name="height" value="0.035" units="cm"/>
+      <inkml:brushProperty name="color" value="#E71224"/>
+    </inkml:brush>
+  </inkml:definitions>
+  <inkml:trace contextRef="#ctx0" brushRef="#br0">0 1 24575,'0'0'-8191</inkml:trace>
+</inkml:ink>
+</file>
+
+<file path=word/ink/ink19.xml><?xml version="1.0" encoding="utf-8"?>
+<inkml:ink xmlns:inkml="http://www.w3.org/2003/InkML">
+  <inkml:definitions>
+    <inkml:context xml:id="ctx0">
+      <inkml:inkSource xml:id="inkSrc0">
+        <inkml:traceFormat>
+          <inkml:channel name="X" type="integer" min="-2.14748E9" max="2.14748E9" units="cm"/>
+          <inkml:channel name="Y" type="integer" min="-2.14748E9" max="2.14748E9" units="cm"/>
+          <inkml:channel name="F" type="integer" max="32767" units="dev"/>
+        </inkml:traceFormat>
+        <inkml:channelProperties>
+          <inkml:channelProperty channel="X" name="resolution" value="1000" units="1/cm"/>
+          <inkml:channelProperty channel="Y" name="resolution" value="1000" units="1/cm"/>
+          <inkml:channelProperty channel="F" name="resolution" value="0" units="1/dev"/>
+        </inkml:channelProperties>
+      </inkml:inkSource>
+      <inkml:timestamp xml:id="ts0" timeString="2025-05-20T15:49:06.030"/>
+    </inkml:context>
+    <inkml:brush xml:id="br0">
+      <inkml:brushProperty name="width" value="0.035" units="cm"/>
+      <inkml:brushProperty name="height" value="0.035" units="cm"/>
+      <inkml:brushProperty name="color" value="#E71224"/>
+    </inkml:brush>
+  </inkml:definitions>
+  <inkml:trace contextRef="#ctx0" brushRef="#br0">0 136 24575,'30'-2'0,"0"-1"0,39-9 0,-40 6 0,0 2 0,45-2 0,1 7 0,93-2 0,-100-6 0,-32 2 0,41 1 0,-25 4 0,93-12 0,-94 7 0,0 2 0,63 5 0,-22 0 0,-24-1 0,75-2 0,-95-8 0,-34 6 0,0 1 0,23-1 0,71 4 0,78-2 0,-125-7 0,-31 4 0,42-1 0,2170 8 0,-1162-5 0,-1057 1 0,35-6 0,23-2 0,978 10 0,-1054-1-136,1 0-1,0-1 1,0 0-1,0 0 1,-1 0-1,1 0 1,0-1-1,-1 0 0,9-5 1,-6 2-6690</inkml:trace>
+</inkml:ink>
+</file>
+
+<file path=word/ink/ink2.xml><?xml version="1.0" encoding="utf-8"?>
+<inkml:ink xmlns:inkml="http://www.w3.org/2003/InkML">
+  <inkml:definitions>
+    <inkml:context xml:id="ctx0">
+      <inkml:inkSource xml:id="inkSrc0">
+        <inkml:traceFormat>
+          <inkml:channel name="X" type="integer" min="-2.14748E9" max="2.14748E9" units="cm"/>
+          <inkml:channel name="Y" type="integer" min="-2.14748E9" max="2.14748E9" units="cm"/>
+          <inkml:channel name="F" type="integer" max="32767" units="dev"/>
+        </inkml:traceFormat>
+        <inkml:channelProperties>
+          <inkml:channelProperty channel="X" name="resolution" value="1000" units="1/cm"/>
+          <inkml:channelProperty channel="Y" name="resolution" value="1000" units="1/cm"/>
+          <inkml:channelProperty channel="F" name="resolution" value="0" units="1/dev"/>
+        </inkml:channelProperties>
+      </inkml:inkSource>
+      <inkml:timestamp xml:id="ts0" timeString="2025-05-20T15:47:33.167"/>
+    </inkml:context>
+    <inkml:brush xml:id="br0">
+      <inkml:brushProperty name="width" value="0.035" units="cm"/>
+      <inkml:brushProperty name="height" value="0.035" units="cm"/>
+      <inkml:brushProperty name="color" value="#E71224"/>
+    </inkml:brush>
+  </inkml:definitions>
+  <inkml:trace contextRef="#ctx0" brushRef="#br0">1 0 24575,'0'0'-8191</inkml:trace>
+</inkml:ink>
+</file>
+
+<file path=word/ink/ink20.xml><?xml version="1.0" encoding="utf-8"?>
+<inkml:ink xmlns:inkml="http://www.w3.org/2003/InkML">
+  <inkml:definitions>
+    <inkml:context xml:id="ctx0">
+      <inkml:inkSource xml:id="inkSrc0">
+        <inkml:traceFormat>
+          <inkml:channel name="X" type="integer" min="-2.14748E9" max="2.14748E9" units="cm"/>
+          <inkml:channel name="Y" type="integer" min="-2.14748E9" max="2.14748E9" units="cm"/>
+          <inkml:channel name="F" type="integer" max="32767" units="dev"/>
+        </inkml:traceFormat>
+        <inkml:channelProperties>
+          <inkml:channelProperty channel="X" name="resolution" value="1000" units="1/cm"/>
+          <inkml:channelProperty channel="Y" name="resolution" value="1000" units="1/cm"/>
+          <inkml:channelProperty channel="F" name="resolution" value="0" units="1/dev"/>
+        </inkml:channelProperties>
+      </inkml:inkSource>
+      <inkml:timestamp xml:id="ts0" timeString="2025-05-20T15:49:01.827"/>
+    </inkml:context>
+    <inkml:brush xml:id="br0">
+      <inkml:brushProperty name="width" value="0.035" units="cm"/>
+      <inkml:brushProperty name="height" value="0.035" units="cm"/>
+      <inkml:brushProperty name="color" value="#E71224"/>
+    </inkml:brush>
+  </inkml:definitions>
+  <inkml:trace contextRef="#ctx0" brushRef="#br0">1 65 23906,'6972'0'0</inkml:trace>
+</inkml:ink>
+</file>
+
+<file path=word/ink/ink21.xml><?xml version="1.0" encoding="utf-8"?>
+<inkml:ink xmlns:inkml="http://www.w3.org/2003/InkML">
+  <inkml:definitions>
+    <inkml:context xml:id="ctx0">
+      <inkml:inkSource xml:id="inkSrc0">
+        <inkml:traceFormat>
+          <inkml:channel name="X" type="integer" min="-2.14748E9" max="2.14748E9" units="cm"/>
+          <inkml:channel name="Y" type="integer" min="-2.14748E9" max="2.14748E9" units="cm"/>
+          <inkml:channel name="F" type="integer" max="32767" units="dev"/>
+        </inkml:traceFormat>
+        <inkml:channelProperties>
+          <inkml:channelProperty channel="X" name="resolution" value="1000" units="1/cm"/>
+          <inkml:channelProperty channel="Y" name="resolution" value="1000" units="1/cm"/>
+          <inkml:channelProperty channel="F" name="resolution" value="0" units="1/dev"/>
+        </inkml:channelProperties>
+      </inkml:inkSource>
+      <inkml:timestamp xml:id="ts0" timeString="2025-05-20T15:49:53.441"/>
+    </inkml:context>
+    <inkml:brush xml:id="br0">
+      <inkml:brushProperty name="width" value="0.035" units="cm"/>
+      <inkml:brushProperty name="height" value="0.035" units="cm"/>
+      <inkml:brushProperty name="color" value="#E71224"/>
+    </inkml:brush>
+  </inkml:definitions>
+  <inkml:trace contextRef="#ctx0" brushRef="#br0">1 4 24575,'0'-3'0</inkml:trace>
+</inkml:ink>
+</file>
+
+<file path=word/ink/ink22.xml><?xml version="1.0" encoding="utf-8"?>
+<inkml:ink xmlns:inkml="http://www.w3.org/2003/InkML">
+  <inkml:definitions>
+    <inkml:context xml:id="ctx0">
+      <inkml:inkSource xml:id="inkSrc0">
+        <inkml:traceFormat>
+          <inkml:channel name="X" type="integer" min="-2.14748E9" max="2.14748E9" units="cm"/>
+          <inkml:channel name="Y" type="integer" min="-2.14748E9" max="2.14748E9" units="cm"/>
+          <inkml:channel name="F" type="integer" max="32767" units="dev"/>
+        </inkml:traceFormat>
+        <inkml:channelProperties>
+          <inkml:channelProperty channel="X" name="resolution" value="1000" units="1/cm"/>
+          <inkml:channelProperty channel="Y" name="resolution" value="1000" units="1/cm"/>
+          <inkml:channelProperty channel="F" name="resolution" value="0" units="1/dev"/>
+        </inkml:channelProperties>
+      </inkml:inkSource>
+      <inkml:timestamp xml:id="ts0" timeString="2025-05-20T15:49:23.836"/>
+    </inkml:context>
+    <inkml:brush xml:id="br0">
+      <inkml:brushProperty name="width" value="0.035" units="cm"/>
+      <inkml:brushProperty name="height" value="0.035" units="cm"/>
+      <inkml:brushProperty name="color" value="#E71224"/>
+    </inkml:brush>
+  </inkml:definitions>
+  <inkml:trace contextRef="#ctx0" brushRef="#br0">1 1 24256,'5422'16'0</inkml:trace>
+</inkml:ink>
+</file>
+
+<file path=word/ink/ink23.xml><?xml version="1.0" encoding="utf-8"?>
+<inkml:ink xmlns:inkml="http://www.w3.org/2003/InkML">
+  <inkml:definitions>
+    <inkml:context xml:id="ctx0">
+      <inkml:inkSource xml:id="inkSrc0">
+        <inkml:traceFormat>
+          <inkml:channel name="X" type="integer" min="-2.14748E9" max="2.14748E9" units="cm"/>
+          <inkml:channel name="Y" type="integer" min="-2.14748E9" max="2.14748E9" units="cm"/>
+          <inkml:channel name="F" type="integer" max="32767" units="dev"/>
+        </inkml:traceFormat>
+        <inkml:channelProperties>
+          <inkml:channelProperty channel="X" name="resolution" value="1000" units="1/cm"/>
+          <inkml:channelProperty channel="Y" name="resolution" value="1000" units="1/cm"/>
+          <inkml:channelProperty channel="F" name="resolution" value="0" units="1/dev"/>
+        </inkml:channelProperties>
+      </inkml:inkSource>
+      <inkml:timestamp xml:id="ts0" timeString="2025-05-20T15:49:52.035"/>
+    </inkml:context>
+    <inkml:brush xml:id="br0">
+      <inkml:brushProperty name="width" value="0.035" units="cm"/>
+      <inkml:brushProperty name="height" value="0.035" units="cm"/>
+      <inkml:brushProperty name="color" value="#E71224"/>
+    </inkml:brush>
+  </inkml:definitions>
+  <inkml:trace contextRef="#ctx0" brushRef="#br0">0 38 24575,'0'-1'0,"1"1"0,-1-1 0,0 0 0,1 0 0,-1 1 0,1-1 0,-1 0 0,1 0 0,-1 1 0,1-1 0,0 0 0,-1 1 0,1-1 0,0 1 0,-1-1 0,1 1 0,0-1 0,0 1 0,0 0 0,-1-1 0,1 1 0,0 0 0,0 0 0,0-1 0,0 1 0,-1 0 0,1 0 0,0 0 0,0 0 0,0 0 0,0 0 0,1 1 0,30 3 0,-22 0 0,-1 0 0,1 0 0,-1-1 0,1 0 0,0 0 0,0-1 0,0-1 0,18 2 0,103 12 0,-101-14 0,2 0 0,-1-1 0,0-1 0,1-2 0,-1-1 0,43-11 0,-59 11 0,0 1 0,-1 0 0,19 0 0,-21 2 0,1 0 0,-1-1 0,0 0 0,0-1 0,17-6 0,-11 4-8,-1 1-1,1 0 1,1 2-1,-1 0 1,0 1-1,1 0 1,34 5-1,7-2-1288,-46-2-5529</inkml:trace>
+</inkml:ink>
+</file>
+
+<file path=word/ink/ink24.xml><?xml version="1.0" encoding="utf-8"?>
+<inkml:ink xmlns:inkml="http://www.w3.org/2003/InkML">
+  <inkml:definitions>
+    <inkml:context xml:id="ctx0">
+      <inkml:inkSource xml:id="inkSrc0">
+        <inkml:traceFormat>
+          <inkml:channel name="X" type="integer" min="-2.14748E9" max="2.14748E9" units="cm"/>
+          <inkml:channel name="Y" type="integer" min="-2.14748E9" max="2.14748E9" units="cm"/>
+          <inkml:channel name="F" type="integer" max="32767" units="dev"/>
+        </inkml:traceFormat>
+        <inkml:channelProperties>
+          <inkml:channelProperty channel="X" name="resolution" value="1000" units="1/cm"/>
+          <inkml:channelProperty channel="Y" name="resolution" value="1000" units="1/cm"/>
+          <inkml:channelProperty channel="F" name="resolution" value="0" units="1/dev"/>
+        </inkml:channelProperties>
+      </inkml:inkSource>
+      <inkml:timestamp xml:id="ts0" timeString="2025-05-20T15:49:49.545"/>
+    </inkml:context>
+    <inkml:brush xml:id="br0">
+      <inkml:brushProperty name="width" value="0.035" units="cm"/>
+      <inkml:brushProperty name="height" value="0.035" units="cm"/>
+      <inkml:brushProperty name="color" value="#E71224"/>
+    </inkml:brush>
+  </inkml:definitions>
+  <inkml:trace contextRef="#ctx0" brushRef="#br0">0 2 23222,'3468'0'0</inkml:trace>
+</inkml:ink>
+</file>
+
+<file path=word/ink/ink3.xml><?xml version="1.0" encoding="utf-8"?>
+<inkml:ink xmlns:inkml="http://www.w3.org/2003/InkML">
+  <inkml:definitions>
+    <inkml:context xml:id="ctx0">
+      <inkml:inkSource xml:id="inkSrc0">
+        <inkml:traceFormat>
+          <inkml:channel name="X" type="integer" min="-2.14748E9" max="2.14748E9" units="cm"/>
+          <inkml:channel name="Y" type="integer" min="-2.14748E9" max="2.14748E9" units="cm"/>
+          <inkml:channel name="F" type="integer" max="32767" units="dev"/>
+        </inkml:traceFormat>
+        <inkml:channelProperties>
+          <inkml:channelProperty channel="X" name="resolution" value="1000" units="1/cm"/>
+          <inkml:channelProperty channel="Y" name="resolution" value="1000" units="1/cm"/>
+          <inkml:channelProperty channel="F" name="resolution" value="0" units="1/dev"/>
+        </inkml:channelProperties>
+      </inkml:inkSource>
+      <inkml:timestamp xml:id="ts0" timeString="2025-05-20T15:47:08.040"/>
+    </inkml:context>
+    <inkml:brush xml:id="br0">
+      <inkml:brushProperty name="width" value="0.035" units="cm"/>
+      <inkml:brushProperty name="height" value="0.035" units="cm"/>
+      <inkml:brushProperty name="color" value="#E71224"/>
+    </inkml:brush>
+  </inkml:definitions>
+  <inkml:trace contextRef="#ctx0" brushRef="#br0">0 51 24575,'68'1'0,"-9"0"0,119-13 0,-50-1 0,-55 7 0,109-10 0,117 10 0,-169 9 0,1115-3-1365,-1231 0-5461</inkml:trace>
+</inkml:ink>
+</file>
+
+<file path=word/ink/ink4.xml><?xml version="1.0" encoding="utf-8"?>
+<inkml:ink xmlns:inkml="http://www.w3.org/2003/InkML">
+  <inkml:definitions>
+    <inkml:context xml:id="ctx0">
+      <inkml:inkSource xml:id="inkSrc0">
+        <inkml:traceFormat>
+          <inkml:channel name="X" type="integer" min="-2.14748E9" max="2.14748E9" units="cm"/>
+          <inkml:channel name="Y" type="integer" min="-2.14748E9" max="2.14748E9" units="cm"/>
+          <inkml:channel name="F" type="integer" max="32767" units="dev"/>
+        </inkml:traceFormat>
+        <inkml:channelProperties>
+          <inkml:channelProperty channel="X" name="resolution" value="1000" units="1/cm"/>
+          <inkml:channelProperty channel="Y" name="resolution" value="1000" units="1/cm"/>
+          <inkml:channelProperty channel="F" name="resolution" value="0" units="1/dev"/>
+        </inkml:channelProperties>
+      </inkml:inkSource>
+      <inkml:timestamp xml:id="ts0" timeString="2025-05-20T15:47:06.282"/>
+    </inkml:context>
+    <inkml:brush xml:id="br0">
+      <inkml:brushProperty name="width" value="0.035" units="cm"/>
+      <inkml:brushProperty name="height" value="0.035" units="cm"/>
+      <inkml:brushProperty name="color" value="#E71224"/>
+    </inkml:brush>
+  </inkml:definitions>
+  <inkml:trace contextRef="#ctx0" brushRef="#br0">0 82 24575,'32'0'0,"42"2"0,81-4 0,-107-6 0,-33 5 0,0 1 0,20-1 0,800 2 0,-383 2 0,-387-9 0,0-1 0,-17 8 0,68-10 0,-65 6 0,1 2 0,62 5 0,-22 0 0,3376-2 0,-3403-8 0,0-1 0,391 10 0,-391-9 0,0-1 0,-38 11 0,1 0 0,-1 2 0,28 7 0,19 4 0,-48-8-1365,-15-4-5461</inkml:trace>
+</inkml:ink>
+</file>
+
+<file path=word/ink/ink5.xml><?xml version="1.0" encoding="utf-8"?>
+<inkml:ink xmlns:inkml="http://www.w3.org/2003/InkML">
+  <inkml:definitions>
+    <inkml:context xml:id="ctx0">
+      <inkml:inkSource xml:id="inkSrc0">
+        <inkml:traceFormat>
+          <inkml:channel name="X" type="integer" min="-2.14748E9" max="2.14748E9" units="cm"/>
+          <inkml:channel name="Y" type="integer" min="-2.14748E9" max="2.14748E9" units="cm"/>
+          <inkml:channel name="F" type="integer" max="32767" units="dev"/>
+        </inkml:traceFormat>
+        <inkml:channelProperties>
+          <inkml:channelProperty channel="X" name="resolution" value="1000" units="1/cm"/>
+          <inkml:channelProperty channel="Y" name="resolution" value="1000" units="1/cm"/>
+          <inkml:channelProperty channel="F" name="resolution" value="0" units="1/dev"/>
+        </inkml:channelProperties>
+      </inkml:inkSource>
+      <inkml:timestamp xml:id="ts0" timeString="2025-05-20T15:46:49.183"/>
+    </inkml:context>
+    <inkml:brush xml:id="br0">
+      <inkml:brushProperty name="width" value="0.035" units="cm"/>
+      <inkml:brushProperty name="height" value="0.035" units="cm"/>
+      <inkml:brushProperty name="color" value="#E71224"/>
+    </inkml:brush>
+  </inkml:definitions>
+  <inkml:trace contextRef="#ctx0" brushRef="#br0">1 1 24575,'0'0'-8191</inkml:trace>
+</inkml:ink>
+</file>
+
+<file path=word/ink/ink6.xml><?xml version="1.0" encoding="utf-8"?>
+<inkml:ink xmlns:inkml="http://www.w3.org/2003/InkML">
+  <inkml:definitions>
+    <inkml:context xml:id="ctx0">
+      <inkml:inkSource xml:id="inkSrc0">
+        <inkml:traceFormat>
+          <inkml:channel name="X" type="integer" min="-2.14748E9" max="2.14748E9" units="cm"/>
+          <inkml:channel name="Y" type="integer" min="-2.14748E9" max="2.14748E9" units="cm"/>
+          <inkml:channel name="F" type="integer" max="32767" units="dev"/>
+        </inkml:traceFormat>
+        <inkml:channelProperties>
+          <inkml:channelProperty channel="X" name="resolution" value="1000" units="1/cm"/>
+          <inkml:channelProperty channel="Y" name="resolution" value="1000" units="1/cm"/>
+          <inkml:channelProperty channel="F" name="resolution" value="0" units="1/dev"/>
+        </inkml:channelProperties>
+      </inkml:inkSource>
+      <inkml:timestamp xml:id="ts0" timeString="2025-05-20T15:47:25.332"/>
+    </inkml:context>
+    <inkml:brush xml:id="br0">
+      <inkml:brushProperty name="width" value="0.035" units="cm"/>
+      <inkml:brushProperty name="height" value="0.035" units="cm"/>
+      <inkml:brushProperty name="color" value="#E71224"/>
+    </inkml:brush>
+  </inkml:definitions>
+  <inkml:trace contextRef="#ctx0" brushRef="#br0">0 5 23513,'9089'0'0</inkml:trace>
+</inkml:ink>
+</file>
+
+<file path=word/ink/ink7.xml><?xml version="1.0" encoding="utf-8"?>
+<inkml:ink xmlns:inkml="http://www.w3.org/2003/InkML">
+  <inkml:definitions>
+    <inkml:context xml:id="ctx0">
+      <inkml:inkSource xml:id="inkSrc0">
+        <inkml:traceFormat>
+          <inkml:channel name="X" type="integer" min="-2.14748E9" max="2.14748E9" units="cm"/>
+          <inkml:channel name="Y" type="integer" min="-2.14748E9" max="2.14748E9" units="cm"/>
+          <inkml:channel name="F" type="integer" max="32767" units="dev"/>
+        </inkml:traceFormat>
+        <inkml:channelProperties>
+          <inkml:channelProperty channel="X" name="resolution" value="1000" units="1/cm"/>
+          <inkml:channelProperty channel="Y" name="resolution" value="1000" units="1/cm"/>
+          <inkml:channelProperty channel="F" name="resolution" value="0" units="1/dev"/>
+        </inkml:channelProperties>
+      </inkml:inkSource>
+      <inkml:timestamp xml:id="ts0" timeString="2025-05-20T15:49:07.818"/>
+    </inkml:context>
+    <inkml:brush xml:id="br0">
+      <inkml:brushProperty name="width" value="0.035" units="cm"/>
+      <inkml:brushProperty name="height" value="0.035" units="cm"/>
+      <inkml:brushProperty name="color" value="#E71224"/>
+    </inkml:brush>
+  </inkml:definitions>
+  <inkml:trace contextRef="#ctx0" brushRef="#br0">0 1 24575,'0'0'-8191</inkml:trace>
+</inkml:ink>
+</file>
+
+<file path=word/ink/ink8.xml><?xml version="1.0" encoding="utf-8"?>
+<inkml:ink xmlns:inkml="http://www.w3.org/2003/InkML">
+  <inkml:definitions>
+    <inkml:context xml:id="ctx0">
+      <inkml:inkSource xml:id="inkSrc0">
+        <inkml:traceFormat>
+          <inkml:channel name="X" type="integer" min="-2.14748E9" max="2.14748E9" units="cm"/>
+          <inkml:channel name="Y" type="integer" min="-2.14748E9" max="2.14748E9" units="cm"/>
+          <inkml:channel name="F" type="integer" max="32767" units="dev"/>
+        </inkml:traceFormat>
+        <inkml:channelProperties>
+          <inkml:channelProperty channel="X" name="resolution" value="1000" units="1/cm"/>
+          <inkml:channelProperty channel="Y" name="resolution" value="1000" units="1/cm"/>
+          <inkml:channelProperty channel="F" name="resolution" value="0" units="1/dev"/>
+        </inkml:channelProperties>
+      </inkml:inkSource>
+      <inkml:timestamp xml:id="ts0" timeString="2025-05-20T15:48:42.133"/>
+    </inkml:context>
+    <inkml:brush xml:id="br0">
+      <inkml:brushProperty name="width" value="0.035" units="cm"/>
+      <inkml:brushProperty name="height" value="0.035" units="cm"/>
+      <inkml:brushProperty name="color" value="#E71224"/>
+    </inkml:brush>
+  </inkml:definitions>
+  <inkml:trace contextRef="#ctx0" brushRef="#br0">0 0 24575,'0'0'-8191</inkml:trace>
+</inkml:ink>
+</file>
+
+<file path=word/ink/ink9.xml><?xml version="1.0" encoding="utf-8"?>
+<inkml:ink xmlns:inkml="http://www.w3.org/2003/InkML">
+  <inkml:definitions>
+    <inkml:context xml:id="ctx0">
+      <inkml:inkSource xml:id="inkSrc0">
+        <inkml:traceFormat>
+          <inkml:channel name="X" type="integer" min="-2.14748E9" max="2.14748E9" units="cm"/>
+          <inkml:channel name="Y" type="integer" min="-2.14748E9" max="2.14748E9" units="cm"/>
+          <inkml:channel name="F" type="integer" max="32767" units="dev"/>
+        </inkml:traceFormat>
+        <inkml:channelProperties>
+          <inkml:channelProperty channel="X" name="resolution" value="1000" units="1/cm"/>
+          <inkml:channelProperty channel="Y" name="resolution" value="1000" units="1/cm"/>
+          <inkml:channelProperty channel="F" name="resolution" value="0" units="1/dev"/>
+        </inkml:channelProperties>
+      </inkml:inkSource>
+      <inkml:timestamp xml:id="ts0" timeString="2025-05-20T15:48:39.527"/>
+    </inkml:context>
+    <inkml:brush xml:id="br0">
+      <inkml:brushProperty name="width" value="0.035" units="cm"/>
+      <inkml:brushProperty name="height" value="0.035" units="cm"/>
+      <inkml:brushProperty name="color" value="#E71224"/>
+    </inkml:brush>
+  </inkml:definitions>
+  <inkml:trace contextRef="#ctx0" brushRef="#br0">1 1 22663,'1367'16'0</inkml:trace>
+</inkml:ink>
+</file>
+
 <file path=word/theme/theme1.xml><?xml version="1.0" encoding="utf-8"?>
 <a:theme xmlns:a="http://schemas.openxmlformats.org/drawingml/2006/main" name="Tema do Office">
   <a:themeElements>

</xml_diff>